<commit_message>
Daily portfolio docs refresh
</commit_message>
<xml_diff>
--- a/DESIGN.docx
+++ b/DESIGN.docx
@@ -53,7 +53,7 @@
           <w:sz w:val="22"/>
           <w:szCs w:val="22"/>
         </w:rPr>
-        <w:t xml:space="preserve">Generated 2026-05-25</w:t>
+        <w:t>Generated 2026-08-06</w:t>
       </w:r>
     </w:p>
     <w:p>
@@ -80,7 +80,7 @@
           <w:sz w:val="22"/>
           <w:szCs w:val="22"/>
         </w:rPr>
-        <w:t xml:space="preserve">This document provides a structured architecture and design overview of all 24 projects in the dev workspace. It covers project categorization, inter-project dependencies, shared libraries, common technology patterns, data-flow pipelines, and a forward-looking roadmap.</w:t>
+        <w:t>This document provides a structured architecture and design overview of all 31 projects in the dev workspace. It covers project categorization, inter-project dependencies, shared libraries, common technology patterns, data-flow pipelines, and a forward-looking roadmap. Note that as of 2026-08-05 the projects themselves live under ~/dev/, not alongside this document in ~/Documents/dev/ — that tree is iCloud-synced and the sub-projects were relocated off it. The one exception is floor-plan-editor, which is in the registry but has no directory under ~/dev/ at all.</w:t>
       </w:r>
     </w:p>
     <w:p>
@@ -124,7 +124,7 @@
           <w:sz w:val="22"/>
           <w:szCs w:val="22"/>
         </w:rPr>
-        <w:t xml:space="preserve">The 24 projects fall into five categories. Production systems share common libraries and interact via file-based or API integration patterns.</w:t>
+        <w:t>The 31 projects fall into six categories. Production systems share common libraries and interact via file-based or API integration patterns.</w:t>
       </w:r>
     </w:p>
     <w:p>
@@ -178,7 +178,7 @@
                 <w:sz w:val="20"/>
                 <w:szCs w:val="20"/>
               </w:rPr>
-              <w:t xml:space="preserve">Category</w:t>
+              <w:t>Category</w:t>
             </w:r>
           </w:p>
         </w:tc>
@@ -209,7 +209,7 @@
                 <w:sz w:val="20"/>
                 <w:szCs w:val="20"/>
               </w:rPr>
-              <w:t xml:space="preserve">Projects</w:t>
+              <w:t>Projects</w:t>
             </w:r>
           </w:p>
         </w:tc>
@@ -240,7 +240,7 @@
                 <w:sz w:val="20"/>
                 <w:szCs w:val="20"/>
               </w:rPr>
-              <w:t xml:space="preserve">Count</w:t>
+              <w:t>Count</w:t>
             </w:r>
           </w:p>
         </w:tc>
@@ -271,7 +271,7 @@
                 <w:sz w:val="20"/>
                 <w:szCs w:val="20"/>
               </w:rPr>
-              <w:t xml:space="preserve">Maturity</w:t>
+              <w:t>Maturity</w:t>
             </w:r>
           </w:p>
         </w:tc>
@@ -304,7 +304,7 @@
                 <w:sz w:val="20"/>
                 <w:szCs w:val="20"/>
               </w:rPr>
-              <w:t xml:space="preserve">Proposal Automation</w:t>
+              <w:t>Proposal Automation</w:t>
             </w:r>
           </w:p>
         </w:tc>
@@ -333,7 +333,7 @@
                 <w:sz w:val="20"/>
                 <w:szCs w:val="20"/>
               </w:rPr>
-              <w:t xml:space="preserve">rfp-automation, cyber-proposals, cyber-estimates, cyber-eac-tool, cyber-artifact-gen</w:t>
+              <w:t>rfp-automation, cyber-artifact-gen</w:t>
             </w:r>
           </w:p>
         </w:tc>
@@ -362,7 +362,7 @@
                 <w:sz w:val="20"/>
                 <w:szCs w:val="20"/>
               </w:rPr>
-              <w:t xml:space="preserve">5</w:t>
+              <w:t>2</w:t>
             </w:r>
           </w:p>
         </w:tc>
@@ -391,7 +391,7 @@
                 <w:sz w:val="20"/>
                 <w:szCs w:val="20"/>
               </w:rPr>
-              <w:t xml:space="preserve">Prod / Active</w:t>
+              <w:t>Prod / Utility</w:t>
             </w:r>
           </w:p>
         </w:tc>
@@ -424,7 +424,7 @@
                 <w:sz w:val="20"/>
                 <w:szCs w:val="20"/>
               </w:rPr>
-              <w:t xml:space="preserve">Document Automation</w:t>
+              <w:t>SSi Productivity</w:t>
             </w:r>
           </w:p>
         </w:tc>
@@ -453,7 +453,7 @@
                 <w:sz w:val="20"/>
                 <w:szCs w:val="20"/>
               </w:rPr>
-              <w:t xml:space="preserve">email-processor, email-monitor, outlook-followup, past-performance, project-tracking</w:t>
+              <w:t>email-processor, past-performance, project-tracking, project-monitor, cyber-brain, project-creation, daily-summary, outlook-followup, fulcrum-replacement</w:t>
             </w:r>
           </w:p>
         </w:tc>
@@ -482,7 +482,7 @@
                 <w:sz w:val="20"/>
                 <w:szCs w:val="20"/>
               </w:rPr>
-              <w:t xml:space="preserve">5</w:t>
+              <w:t>9</w:t>
             </w:r>
           </w:p>
         </w:tc>
@@ -511,7 +511,7 @@
                 <w:sz w:val="20"/>
                 <w:szCs w:val="20"/>
               </w:rPr>
-              <w:t xml:space="preserve">Prod / v1 / Stub</w:t>
+              <w:t>Prod / v1–v2 / Design</w:t>
             </w:r>
           </w:p>
         </w:tc>
@@ -544,7 +544,7 @@
                 <w:sz w:val="20"/>
                 <w:szCs w:val="20"/>
               </w:rPr>
-              <w:t xml:space="preserve">Network / OT Tools</w:t>
+              <w:t>Network / OT Tools</w:t>
             </w:r>
           </w:p>
         </w:tc>
@@ -573,7 +573,7 @@
                 <w:sz w:val="20"/>
                 <w:szCs w:val="20"/>
               </w:rPr>
-              <w:t xml:space="preserve">network-scanner, ethernet-link-analyzer, virtual-devices, digital-twin, Pocket Probe, PRTG Import, kml</w:t>
+              <w:t>network-scanner, ethernet-link-analyzer, virtual-devices, digital-twin, niagara-llm, siem-forwarder, pocket-probe, prtg-import, kml</w:t>
             </w:r>
           </w:p>
         </w:tc>
@@ -602,7 +602,7 @@
                 <w:sz w:val="20"/>
                 <w:szCs w:val="20"/>
               </w:rPr>
-              <w:t xml:space="preserve">7</w:t>
+              <w:t>9</w:t>
             </w:r>
           </w:p>
         </w:tc>
@@ -631,7 +631,7 @@
                 <w:sz w:val="20"/>
                 <w:szCs w:val="20"/>
               </w:rPr>
-              <w:t xml:space="preserve">Prod / Proto</w:t>
+              <w:t>Prod / v1–v2 / Proto</w:t>
             </w:r>
           </w:p>
         </w:tc>
@@ -664,7 +664,7 @@
                 <w:sz w:val="20"/>
                 <w:szCs w:val="20"/>
               </w:rPr>
-              <w:t xml:space="preserve">Platform / Shared</w:t>
+              <w:t>Platform / Shared</w:t>
             </w:r>
           </w:p>
         </w:tc>
@@ -693,7 +693,7 @@
                 <w:sz w:val="20"/>
                 <w:szCs w:val="20"/>
               </w:rPr>
-              <w:t xml:space="preserve">account-store, ssi-design-system, cert-manager, claude-sync</w:t>
+              <w:t>account-store, niagara-config, ssi-design-system, cert-manager, claude-sync, claude-memory-compiler</w:t>
             </w:r>
           </w:p>
         </w:tc>
@@ -722,7 +722,7 @@
                 <w:sz w:val="20"/>
                 <w:szCs w:val="20"/>
               </w:rPr>
-              <w:t xml:space="preserve">4</w:t>
+              <w:t>6</w:t>
             </w:r>
           </w:p>
         </w:tc>
@@ -751,7 +751,7 @@
                 <w:sz w:val="20"/>
                 <w:szCs w:val="20"/>
               </w:rPr>
-              <w:t xml:space="preserve">Lib / v0–v1</w:t>
+              <w:t>Lib / v0–v1</w:t>
             </w:r>
           </w:p>
         </w:tc>
@@ -784,7 +784,7 @@
                 <w:sz w:val="20"/>
                 <w:szCs w:val="20"/>
               </w:rPr>
-              <w:t xml:space="preserve">Standalone / Reference</w:t>
+              <w:t>Standalone Tools</w:t>
             </w:r>
           </w:p>
         </w:tc>
@@ -813,7 +813,7 @@
                 <w:sz w:val="20"/>
                 <w:szCs w:val="20"/>
               </w:rPr>
-              <w:t xml:space="preserve">floor-plan-editor, niagara-docs, scripts</w:t>
+              <w:t>sanguine, scribe, floor-plan-editor</w:t>
             </w:r>
           </w:p>
         </w:tc>
@@ -842,7 +842,7 @@
                 <w:sz w:val="20"/>
                 <w:szCs w:val="20"/>
               </w:rPr>
-              <w:t xml:space="preserve">3</w:t>
+              <w:t>3</w:t>
             </w:r>
           </w:p>
         </w:tc>
@@ -871,7 +871,49 @@
                 <w:sz w:val="20"/>
                 <w:szCs w:val="20"/>
               </w:rPr>
-              <w:t xml:space="preserve">Active / Stub</w:t>
+              <w:t>v1 / v0.1 / missing on this Mac</w:t>
+            </w:r>
+          </w:p>
+        </w:tc>
+      </w:tr>
+      <w:tr>
+        <w:tc>
+          <w:tcPr>
+            <w:tcW w:type="dxa" w:w="2200"/>
+          </w:tcPr>
+          <w:p>
+            <w:r>
+              <w:t>Reference</w:t>
+            </w:r>
+          </w:p>
+        </w:tc>
+        <w:tc>
+          <w:tcPr>
+            <w:tcW w:type="dxa" w:w="4360"/>
+          </w:tcPr>
+          <w:p>
+            <w:r>
+              <w:t>niagara-docs, scripts</w:t>
+            </w:r>
+          </w:p>
+        </w:tc>
+        <w:tc>
+          <w:tcPr>
+            <w:tcW w:type="dxa" w:w="1400"/>
+          </w:tcPr>
+          <w:p>
+            <w:r>
+              <w:t>2</w:t>
+            </w:r>
+          </w:p>
+        </w:tc>
+        <w:tc>
+          <w:tcPr>
+            <w:tcW w:type="dxa" w:w="1400"/>
+          </w:tcPr>
+          <w:p>
+            <w:r>
+              <w:t>Stub / Active</w:t>
             </w:r>
           </w:p>
         </w:tc>
@@ -935,7 +977,7 @@
           <w:sz w:val="22"/>
           <w:szCs w:val="22"/>
         </w:rPr>
-        <w:t xml:space="preserve">Pip-installable Python library providing local user account management with pbkdf2_sha256 password hashing, role-based access (admin/reviewer/viewer), and JSON-backed storage. Extracted from rfp-automation so all multi-user apps draw from the same auth model.</w:t>
+        <w:t>Pip-installable Python library providing local user account management with pbkdf2_sha256 password hashing, role-based access (admin/reviewer/viewer), and JSON-backed storage. Extracted from rfp-automation so all multi-user apps draw from the same auth model. It is the portfolio's most widely shared dependency.</w:t>
       </w:r>
     </w:p>
     <w:p>
@@ -951,7 +993,7 @@
           <w:sz w:val="22"/>
           <w:szCs w:val="22"/>
         </w:rPr>
-        <w:t xml:space="preserve">Consumers: </w:t>
+        <w:t>Consumers (8): rfp-automation, project-tracking, email-processor, past-performance, project-monitor, cert-manager, project-creation, digital-twin (twin/auth.py).</w:t>
       </w:r>
       <w:r>
         <w:rPr>
@@ -960,7 +1002,6 @@
           <w:sz w:val="22"/>
           <w:szCs w:val="22"/>
         </w:rPr>
-        <w:t xml:space="preserve">rfp-automation, project-tracking, email-processor</w:t>
       </w:r>
     </w:p>
     <w:p>
@@ -976,7 +1017,7 @@
           <w:sz w:val="22"/>
           <w:szCs w:val="22"/>
         </w:rPr>
-        <w:t xml:space="preserve">Interface: </w:t>
+        <w:t>Interface: pip install; configure(state_dir=...) then add_user/authenticate/get/list/delete. Caveat: consumers bind this library five different ways — absolute path in pyproject.toml, editable install, a direct site-packages symlink, a bare PYTHONPATH, and a tool.uv.sources relative path. None of them survive the library moving without an actual reinstall, because uv/setuptools bake the resolved absolute path into the installed finder at install time.</w:t>
       </w:r>
       <w:r>
         <w:rPr>
@@ -985,7 +1026,6 @@
           <w:sz w:val="22"/>
           <w:szCs w:val="22"/>
         </w:rPr>
-        <w:t xml:space="preserve">pip install; AccountStore class; create/authenticate/get/list/delete methods.</w:t>
       </w:r>
     </w:p>
     <w:p>
@@ -1032,7 +1072,7 @@
           <w:sz w:val="22"/>
           <w:szCs w:val="22"/>
         </w:rPr>
-        <w:t xml:space="preserve">Consumers: </w:t>
+        <w:t>Consumers: apps.json marks six enabled — project-tracking (the v0 pilot), rfp-automation, email-processor, cyber-artifact-gen, digital-twin, and floor-plan-editor. scribe carries a synced brand bundle but has no apps.json entry, so it drifts on every rebuild.</w:t>
       </w:r>
       <w:r>
         <w:rPr>
@@ -1041,7 +1081,6 @@
           <w:sz w:val="22"/>
           <w:szCs w:val="22"/>
         </w:rPr>
-        <w:t xml:space="preserve">project-tracking (v0 pilot); planned for all SSi web apps and docx generators.</w:t>
       </w:r>
     </w:p>
     <w:p>
@@ -1057,7 +1096,7 @@
           <w:sz w:val="22"/>
           <w:szCs w:val="22"/>
         </w:rPr>
-        <w:t xml:space="preserve">Phases complete: </w:t>
+        <w:t>Phases complete: 1 (token definitions), 2 (CSS build), 3 (Python brand.py + sync script). Light/dark theme supported. Also home to the SSi Niagara 4 engineering standard: point naming contract, point dictionary, data-driven plant graphics (PNG/Px/SVG), 10 Px view templates, and a Px authoring guide. Known issue: apps.json's _root still points at the pre-migration /Users/ogreen/Documents/dev, and sync.py resolves every target as _root / name / target — so a sync run currently skips all six consumers with “app directory not found”. One-line fix, plus a decision on the floor-plan-editor entry, which is enabled but has no directory anywhere.</w:t>
       </w:r>
       <w:r>
         <w:rPr>
@@ -1066,7 +1105,6 @@
           <w:sz w:val="22"/>
           <w:szCs w:val="22"/>
         </w:rPr>
-        <w:t xml:space="preserve">1 (token definitions), 2 (CSS build), 3 (Python brand.py + sync script). Light/dark theme supported.</w:t>
       </w:r>
     </w:p>
     <w:p>
@@ -1083,7 +1121,7 @@
           <w:sz w:val="26"/>
           <w:szCs w:val="26"/>
         </w:rPr>
-        <w:t xml:space="preserve">2.3 cyber-proposals</w:t>
+        <w:t>2.3 niagara-config</w:t>
       </w:r>
     </w:p>
     <w:p>
@@ -1097,7 +1135,7 @@
           <w:sz w:val="22"/>
           <w:szCs w:val="22"/>
         </w:rPr>
-        <w:t xml:space="preserve">Shared DoD MILCON cybersecurity proposal engine covering two USACE MATOCs (MRR + UMCS). Provides pricing defaults per MATOC, role codes, scope extraction, and tech proposal generation with prompt-cached Claude API calls. Not a library in the pip sense — consumed via direct import or subprocess.</w:t>
+        <w:t>Small, dependency-light Python library (pydantic only) that parses Niagara Supervisor backups (config.bog) and classifies station points into an equipment/role semantic model. Extracted from niagara-llm in 2026-07 to be the single source of truth for Niagara-backup handling. Its semantic Role/EquipType values are the canonical vocabulary both consumers bind to. Public API spans backup, semantic, model, topology, catalog, and sources.base (the abstract StationDataSource contract).</w:t>
       </w:r>
     </w:p>
     <w:p>
@@ -1113,7 +1151,7 @@
           <w:sz w:val="22"/>
           <w:szCs w:val="22"/>
         </w:rPr>
-        <w:t xml:space="preserve">Consumers: </w:t>
+        <w:t>Consumers: niagara-llm (via one-line re-export shims, so its existing imports are unchanged) and digital-twin (config-driven mode, including the rev-2.15 backup history replay, which reads niagara_config.backup.csv_history_lookup's format). Note: the former 2.3 entry here, cyber-proposals, was archived 2026-07-14 — its NAVFAC/USACE proposal and pricing logic now ships as the navfac-cyber-proposal Claude skill.</w:t>
       </w:r>
       <w:r>
         <w:rPr>
@@ -1122,7 +1160,6 @@
           <w:sz w:val="22"/>
           <w:szCs w:val="22"/>
         </w:rPr>
-        <w:t xml:space="preserve">cyber-estimates (direct), rfp-automation (adapter hooks).</w:t>
       </w:r>
     </w:p>
     <w:p>
@@ -1237,7 +1274,7 @@
                 <w:sz w:val="20"/>
                 <w:szCs w:val="20"/>
               </w:rPr>
-              <w:t xml:space="preserve">#</w:t>
+              <w:t>#</w:t>
             </w:r>
           </w:p>
         </w:tc>
@@ -1268,7 +1305,7 @@
                 <w:sz w:val="20"/>
                 <w:szCs w:val="20"/>
               </w:rPr>
-              <w:t xml:space="preserve">Stage</w:t>
+              <w:t>Stage</w:t>
             </w:r>
           </w:p>
         </w:tc>
@@ -1299,7 +1336,7 @@
                 <w:sz w:val="20"/>
                 <w:szCs w:val="20"/>
               </w:rPr>
-              <w:t xml:space="preserve">Tool</w:t>
+              <w:t>Tool</w:t>
             </w:r>
           </w:p>
         </w:tc>
@@ -1330,7 +1367,7 @@
                 <w:sz w:val="20"/>
                 <w:szCs w:val="20"/>
               </w:rPr>
-              <w:t xml:space="preserve">Output</w:t>
+              <w:t>Output</w:t>
             </w:r>
           </w:p>
         </w:tc>
@@ -1361,7 +1398,7 @@
                 <w:sz w:val="20"/>
                 <w:szCs w:val="20"/>
               </w:rPr>
-              <w:t xml:space="preserve">1</w:t>
+              <w:t>1</w:t>
             </w:r>
           </w:p>
         </w:tc>
@@ -1390,7 +1427,7 @@
                 <w:sz w:val="20"/>
                 <w:szCs w:val="20"/>
               </w:rPr>
-              <w:t xml:space="preserve">RFP Intake &amp; Classification</w:t>
+              <w:t>RFP Intake &amp; Classification</w:t>
             </w:r>
           </w:p>
         </w:tc>
@@ -1419,7 +1456,7 @@
                 <w:sz w:val="20"/>
                 <w:szCs w:val="20"/>
               </w:rPr>
-              <w:t xml:space="preserve">rfp-automation (FastAPI dashboard, port 8108)</w:t>
+              <w:t>rfp-automation (FastAPI dashboard, port 8008)</w:t>
             </w:r>
           </w:p>
         </w:tc>
@@ -1448,7 +1485,7 @@
                 <w:sz w:val="20"/>
                 <w:szCs w:val="20"/>
               </w:rPr>
-              <w:t xml:space="preserve">Classified scope JSON, UFGS tags (25 05 11 / 25 08 11)</w:t>
+              <w:t>Classified scope JSON, UFGS tags (25 05 11 / 25 08 11)</w:t>
             </w:r>
           </w:p>
         </w:tc>
@@ -1479,7 +1516,7 @@
                 <w:sz w:val="20"/>
                 <w:szCs w:val="20"/>
               </w:rPr>
-              <w:t xml:space="preserve">2</w:t>
+              <w:t>2</w:t>
             </w:r>
           </w:p>
         </w:tc>
@@ -1508,7 +1545,7 @@
                 <w:sz w:val="20"/>
                 <w:szCs w:val="20"/>
               </w:rPr>
-              <w:t xml:space="preserve">Portal Document Fetch</w:t>
+              <w:t>Portal Document Fetch</w:t>
             </w:r>
           </w:p>
         </w:tc>
@@ -1537,7 +1574,7 @@
                 <w:sz w:val="20"/>
                 <w:szCs w:val="20"/>
               </w:rPr>
-              <w:t xml:space="preserve">rfp-automation (Playwright fetchers → MRAS/SAM/eBuy/PIEE)</w:t>
+              <w:t>rfp-automation (Playwright → MRAS/SAM/eBuy/PIEE)</w:t>
             </w:r>
           </w:p>
         </w:tc>
@@ -1566,7 +1603,7 @@
                 <w:sz w:val="20"/>
                 <w:szCs w:val="20"/>
               </w:rPr>
-              <w:t xml:space="preserve">PWS PDF, SOW, drawings, Q&amp;A</w:t>
+              <w:t>PWS PDF, SOW, drawings, Q&amp;A</w:t>
             </w:r>
           </w:p>
         </w:tc>
@@ -1597,7 +1634,7 @@
                 <w:sz w:val="20"/>
                 <w:szCs w:val="20"/>
               </w:rPr>
-              <w:t xml:space="preserve">3</w:t>
+              <w:t>3</w:t>
             </w:r>
           </w:p>
         </w:tc>
@@ -1626,7 +1663,7 @@
                 <w:sz w:val="20"/>
                 <w:szCs w:val="20"/>
               </w:rPr>
-              <w:t xml:space="preserve">Scope Extraction</w:t>
+              <w:t>Scope Extraction</w:t>
             </w:r>
           </w:p>
         </w:tc>
@@ -1655,7 +1692,7 @@
                 <w:sz w:val="20"/>
                 <w:szCs w:val="20"/>
               </w:rPr>
-              <w:t xml:space="preserve">rfp-automation + Claude API (prompt-cached)</w:t>
+              <w:t>rfp-automation + Claude API (prompt-cached)</w:t>
             </w:r>
           </w:p>
         </w:tc>
@@ -1684,7 +1721,7 @@
                 <w:sz w:val="20"/>
                 <w:szCs w:val="20"/>
               </w:rPr>
-              <w:t xml:space="preserve">Structured scope items, submittal matrix</w:t>
+              <w:t>Structured scope items, submittal matrix</w:t>
             </w:r>
           </w:p>
         </w:tc>
@@ -1715,7 +1752,7 @@
                 <w:sz w:val="20"/>
                 <w:szCs w:val="20"/>
               </w:rPr>
-              <w:t xml:space="preserve">4</w:t>
+              <w:t>4</w:t>
             </w:r>
           </w:p>
         </w:tc>
@@ -1744,7 +1781,7 @@
                 <w:sz w:val="20"/>
                 <w:szCs w:val="20"/>
               </w:rPr>
-              <w:t xml:space="preserve">Pricing Workbook</w:t>
+              <w:t>Pricing &amp; Tech Proposal</w:t>
             </w:r>
           </w:p>
         </w:tc>
@@ -1773,7 +1810,7 @@
                 <w:sz w:val="20"/>
                 <w:szCs w:val="20"/>
               </w:rPr>
-              <w:t xml:space="preserve">cyber-proposals / cyber-estimates (openpyxl)</w:t>
+              <w:t>navfac-cyber-proposal Claude skill (replaced the archived cyber-proposals / cyber-estimates)</w:t>
             </w:r>
           </w:p>
         </w:tc>
@@ -1802,7 +1839,7 @@
                 <w:sz w:val="20"/>
                 <w:szCs w:val="20"/>
               </w:rPr>
-              <w:t xml:space="preserve">CLIN-structured Excel workbook</w:t>
+              <w:t>CLIN-structured pricing workbook + draft .docx</w:t>
             </w:r>
           </w:p>
         </w:tc>
@@ -1833,7 +1870,7 @@
                 <w:sz w:val="20"/>
                 <w:szCs w:val="20"/>
               </w:rPr>
-              <w:t xml:space="preserve">5</w:t>
+              <w:t>5</w:t>
             </w:r>
           </w:p>
         </w:tc>
@@ -1862,7 +1899,7 @@
                 <w:sz w:val="20"/>
                 <w:szCs w:val="20"/>
               </w:rPr>
-              <w:t xml:space="preserve">Tech Proposal Draft</w:t>
+              <w:t>Past-Performance Evidence</w:t>
             </w:r>
           </w:p>
         </w:tc>
@@ -1891,7 +1928,7 @@
                 <w:sz w:val="20"/>
                 <w:szCs w:val="20"/>
               </w:rPr>
-              <w:t xml:space="preserve">cyber-proposals (python-docx + docx.js)</w:t>
+              <w:t>past-performance (FTS5 + Voyage AI retrieval, port 8767)</w:t>
             </w:r>
           </w:p>
         </w:tc>
@@ -1920,7 +1957,7 @@
                 <w:sz w:val="20"/>
                 <w:szCs w:val="20"/>
               </w:rPr>
-              <w:t xml:space="preserve">Draft .docx with UFGS-compliant scope sections</w:t>
+              <w:t>Cited PP write-ups drafted in SSI's template</w:t>
             </w:r>
           </w:p>
         </w:tc>
@@ -1951,7 +1988,7 @@
                 <w:sz w:val="20"/>
                 <w:szCs w:val="20"/>
               </w:rPr>
-              <w:t xml:space="preserve">6</w:t>
+              <w:t>6</w:t>
             </w:r>
           </w:p>
         </w:tc>
@@ -1980,7 +2017,7 @@
                 <w:sz w:val="20"/>
                 <w:szCs w:val="20"/>
               </w:rPr>
-              <w:t xml:space="preserve">EAC Tracking (post-award)</w:t>
+              <w:t>Site Artifacts</w:t>
             </w:r>
           </w:p>
         </w:tc>
@@ -2009,7 +2046,7 @@
                 <w:sz w:val="20"/>
                 <w:szCs w:val="20"/>
               </w:rPr>
-              <w:t xml:space="preserve">cyber-eac-tool (browser, port 8010)</w:t>
+              <w:t>cyber-artifact-gen</w:t>
             </w:r>
           </w:p>
         </w:tc>
@@ -2038,7 +2075,7 @@
                 <w:sz w:val="20"/>
                 <w:szCs w:val="20"/>
               </w:rPr>
-              <w:t xml:space="preserve">EAC/ETC/CPI/SPI dashboard + Excel export</w:t>
+              <w:t>Hardware/software diagrams, network schematics</w:t>
             </w:r>
           </w:p>
         </w:tc>
@@ -2069,7 +2106,7 @@
                 <w:sz w:val="20"/>
                 <w:szCs w:val="20"/>
               </w:rPr>
-              <w:t xml:space="preserve">7</w:t>
+              <w:t>7</w:t>
             </w:r>
           </w:p>
         </w:tc>
@@ -2098,7 +2135,7 @@
                 <w:sz w:val="20"/>
                 <w:szCs w:val="20"/>
               </w:rPr>
-              <w:t xml:space="preserve">Site Artifacts</w:t>
+              <w:t>Post-Award Provisioning</w:t>
             </w:r>
           </w:p>
         </w:tc>
@@ -2127,7 +2164,7 @@
                 <w:sz w:val="20"/>
                 <w:szCs w:val="20"/>
               </w:rPr>
-              <w:t xml:space="preserve">cyber-artifact-gen</w:t>
+              <w:t>project-creation (Graph app-only; port 8773 reserved, CLI still a stub)</w:t>
             </w:r>
           </w:p>
         </w:tc>
@@ -2156,7 +2193,49 @@
                 <w:sz w:val="20"/>
                 <w:szCs w:val="20"/>
               </w:rPr>
-              <w:t xml:space="preserve">Hardware/software diagrams, network schematics</w:t>
+              <w:t>SharePoint site + Planner plan</w:t>
+            </w:r>
+          </w:p>
+        </w:tc>
+      </w:tr>
+      <w:tr>
+        <w:tc>
+          <w:tcPr>
+            <w:tcW w:type="dxa" w:w="480"/>
+          </w:tcPr>
+          <w:p>
+            <w:r>
+              <w:t>8</w:t>
+            </w:r>
+          </w:p>
+        </w:tc>
+        <w:tc>
+          <w:tcPr>
+            <w:tcW w:type="dxa" w:w="2200"/>
+          </w:tcPr>
+          <w:p>
+            <w:r>
+              <w:t>Execution Tracking</w:t>
+            </w:r>
+          </w:p>
+        </w:tc>
+        <w:tc>
+          <w:tcPr>
+            <w:tcW w:type="dxa" w:w="3080"/>
+          </w:tcPr>
+          <w:p>
+            <w:r>
+              <w:t>project-tracking (port 443) + project-monitor (port 8769)</w:t>
+            </w:r>
+          </w:p>
+        </w:tc>
+        <w:tc>
+          <w:tcPr>
+            <w:tcW w:type="dxa" w:w="3600"/>
+          </w:tcPr>
+          <w:p>
+            <w:r>
+              <w:t>Budget/labor/submittal dashboards; contract/mod/PO/invoice registers</w:t>
             </w:r>
           </w:p>
         </w:tc>
@@ -2249,7 +2328,7 @@
                 <w:sz w:val="20"/>
                 <w:szCs w:val="20"/>
               </w:rPr>
-              <w:t xml:space="preserve">#</w:t>
+              <w:t>#</w:t>
             </w:r>
           </w:p>
         </w:tc>
@@ -2280,7 +2359,7 @@
                 <w:sz w:val="20"/>
                 <w:szCs w:val="20"/>
               </w:rPr>
-              <w:t xml:space="preserve">Stage</w:t>
+              <w:t>Stage</w:t>
             </w:r>
           </w:p>
         </w:tc>
@@ -2311,7 +2390,7 @@
                 <w:sz w:val="20"/>
                 <w:szCs w:val="20"/>
               </w:rPr>
-              <w:t xml:space="preserve">Tool</w:t>
+              <w:t>Tool</w:t>
             </w:r>
           </w:p>
         </w:tc>
@@ -2342,7 +2421,7 @@
                 <w:sz w:val="20"/>
                 <w:szCs w:val="20"/>
               </w:rPr>
-              <w:t xml:space="preserve">Output</w:t>
+              <w:t>Output</w:t>
             </w:r>
           </w:p>
         </w:tc>
@@ -2373,7 +2452,7 @@
                 <w:sz w:val="20"/>
                 <w:szCs w:val="20"/>
               </w:rPr>
-              <w:t xml:space="preserve">1</w:t>
+              <w:t>1</w:t>
             </w:r>
           </w:p>
         </w:tc>
@@ -2402,7 +2481,7 @@
                 <w:sz w:val="20"/>
                 <w:szCs w:val="20"/>
               </w:rPr>
-              <w:t xml:space="preserve">Email Ingestion</w:t>
+              <w:t>Email Ingestion</w:t>
             </w:r>
           </w:p>
         </w:tc>
@@ -2431,7 +2510,7 @@
                 <w:sz w:val="20"/>
                 <w:szCs w:val="20"/>
               </w:rPr>
-              <w:t xml:space="preserve">email-processor (watcher daemon)</w:t>
+              <w:t>email-processor (watcher daemon)</w:t>
             </w:r>
           </w:p>
         </w:tc>
@@ -2460,7 +2539,7 @@
                 <w:sz w:val="20"/>
                 <w:szCs w:val="20"/>
               </w:rPr>
-              <w:t xml:space="preserve">Parsed email metadata + attachments</w:t>
+              <w:t>Parsed email metadata + attachments</w:t>
             </w:r>
           </w:p>
         </w:tc>
@@ -2491,7 +2570,7 @@
                 <w:sz w:val="20"/>
                 <w:szCs w:val="20"/>
               </w:rPr>
-              <w:t xml:space="preserve">2</w:t>
+              <w:t>2</w:t>
             </w:r>
           </w:p>
         </w:tc>
@@ -2520,7 +2599,7 @@
                 <w:sz w:val="20"/>
                 <w:szCs w:val="20"/>
               </w:rPr>
-              <w:t xml:space="preserve">Portal Fetch</w:t>
+              <w:t>Portal Fetch</w:t>
             </w:r>
           </w:p>
         </w:tc>
@@ -2549,7 +2628,7 @@
                 <w:sz w:val="20"/>
                 <w:szCs w:val="20"/>
               </w:rPr>
-              <w:t xml:space="preserve">email-processor (Playwright fetchers)</w:t>
+              <w:t>email-processor (Playwright fetchers)</w:t>
             </w:r>
           </w:p>
         </w:tc>
@@ -2578,7 +2657,7 @@
                 <w:sz w:val="20"/>
                 <w:szCs w:val="20"/>
               </w:rPr>
-              <w:t xml:space="preserve">PWS/SOW PDFs, Q&amp;A documents</w:t>
+              <w:t>PWS/SOW PDFs, Q&amp;A documents</w:t>
             </w:r>
           </w:p>
         </w:tc>
@@ -2609,7 +2688,7 @@
                 <w:sz w:val="20"/>
                 <w:szCs w:val="20"/>
               </w:rPr>
-              <w:t xml:space="preserve">3</w:t>
+              <w:t>3</w:t>
             </w:r>
           </w:p>
         </w:tc>
@@ -2638,7 +2717,7 @@
                 <w:sz w:val="20"/>
                 <w:szCs w:val="20"/>
               </w:rPr>
-              <w:t xml:space="preserve">Summarization</w:t>
+              <w:t>Summarization &amp; Bid Call</w:t>
             </w:r>
           </w:p>
         </w:tc>
@@ -2667,7 +2746,7 @@
                 <w:sz w:val="20"/>
                 <w:szCs w:val="20"/>
               </w:rPr>
-              <w:t xml:space="preserve">email-processor + Claude API</w:t>
+              <w:t>email-processor + Claude API (locked system prompt)</w:t>
             </w:r>
           </w:p>
         </w:tc>
@@ -2696,7 +2775,7 @@
                 <w:sz w:val="20"/>
                 <w:szCs w:val="20"/>
               </w:rPr>
-              <w:t xml:space="preserve">Obsidian .md note + structured summary</w:t>
+              <w:t>Obsidian .md note + a pursue-prime / pursue-sub / watch / pass call with fit assessment</w:t>
             </w:r>
           </w:p>
         </w:tc>
@@ -2727,7 +2806,7 @@
                 <w:sz w:val="20"/>
                 <w:szCs w:val="20"/>
               </w:rPr>
-              <w:t xml:space="preserve">4</w:t>
+              <w:t>4</w:t>
             </w:r>
           </w:p>
         </w:tc>
@@ -2756,7 +2835,7 @@
                 <w:sz w:val="20"/>
                 <w:szCs w:val="20"/>
               </w:rPr>
-              <w:t xml:space="preserve">Document Output</w:t>
+              <w:t>Document Output</w:t>
             </w:r>
           </w:p>
         </w:tc>
@@ -2785,7 +2864,7 @@
                 <w:sz w:val="20"/>
                 <w:szCs w:val="20"/>
               </w:rPr>
-              <w:t xml:space="preserve">email-processor (python-docx)</w:t>
+              <w:t>email-processor (python-docx), dashboard on port 8765</w:t>
             </w:r>
           </w:p>
         </w:tc>
@@ -2814,7 +2893,7 @@
                 <w:sz w:val="20"/>
                 <w:szCs w:val="20"/>
               </w:rPr>
-              <w:t xml:space="preserve">Formatted .docx brief + webserver dashboard</w:t>
+              <w:t>Formatted .docx brief + dashboard entry</w:t>
             </w:r>
           </w:p>
         </w:tc>
@@ -2845,7 +2924,7 @@
                 <w:sz w:val="20"/>
                 <w:szCs w:val="20"/>
               </w:rPr>
-              <w:t xml:space="preserve">5</w:t>
+              <w:t>5</w:t>
             </w:r>
           </w:p>
         </w:tc>
@@ -2874,7 +2953,7 @@
                 <w:sz w:val="20"/>
                 <w:szCs w:val="20"/>
               </w:rPr>
-              <w:t xml:space="preserve">Past Performance Lookup</w:t>
+              <w:t>Past Performance Lookup</w:t>
             </w:r>
           </w:p>
         </w:tc>
@@ -2903,7 +2982,7 @@
                 <w:sz w:val="20"/>
                 <w:szCs w:val="20"/>
               </w:rPr>
-              <w:t xml:space="preserve">past-performance (FTS5 search)</w:t>
+              <w:t>past-performance (FTS5 + embeddings, port 8767)</w:t>
             </w:r>
           </w:p>
         </w:tc>
@@ -2932,7 +3011,7 @@
                 <w:sz w:val="20"/>
                 <w:szCs w:val="20"/>
               </w:rPr>
-              <w:t xml:space="preserve">Relevant PP references for bid/no-bid</w:t>
+              <w:t>Relevant PP references for bid/no-bid</w:t>
             </w:r>
           </w:p>
         </w:tc>
@@ -2963,7 +3042,7 @@
                 <w:sz w:val="20"/>
                 <w:szCs w:val="20"/>
               </w:rPr>
-              <w:t xml:space="preserve">6</w:t>
+              <w:t>6</w:t>
             </w:r>
           </w:p>
         </w:tc>
@@ -2992,7 +3071,7 @@
                 <w:sz w:val="20"/>
                 <w:szCs w:val="20"/>
               </w:rPr>
-              <w:t xml:space="preserve">Financial Tracking</w:t>
+              <w:t>Meeting Capture</w:t>
             </w:r>
           </w:p>
         </w:tc>
@@ -3021,7 +3100,7 @@
                 <w:sz w:val="20"/>
                 <w:szCs w:val="20"/>
               </w:rPr>
-              <w:t xml:space="preserve">project-tracking (FastAPI portal)</w:t>
+              <w:t>scribe (Whisper/MLX + pyannote + Ollama, port 8736)</w:t>
             </w:r>
           </w:p>
         </w:tc>
@@ -3050,7 +3129,49 @@
                 <w:sz w:val="20"/>
                 <w:szCs w:val="20"/>
               </w:rPr>
-              <w:t xml:space="preserve">Per-job budget/labor/submittal dashboard</w:t>
+              <w:t>Transcripts, decisions, action items, recap email draft</w:t>
+            </w:r>
+          </w:p>
+        </w:tc>
+      </w:tr>
+      <w:tr>
+        <w:tc>
+          <w:tcPr>
+            <w:tcW w:type="dxa" w:w="480"/>
+          </w:tcPr>
+          <w:p>
+            <w:r>
+              <w:t>7</w:t>
+            </w:r>
+          </w:p>
+        </w:tc>
+        <w:tc>
+          <w:tcPr>
+            <w:tcW w:type="dxa" w:w="2200"/>
+          </w:tcPr>
+          <w:p>
+            <w:r>
+              <w:t>Financial Tracking</w:t>
+            </w:r>
+          </w:p>
+        </w:tc>
+        <w:tc>
+          <w:tcPr>
+            <w:tcW w:type="dxa" w:w="3080"/>
+          </w:tcPr>
+          <w:p>
+            <w:r>
+              <w:t>project-tracking (FastAPI portal, port 443)</w:t>
+            </w:r>
+          </w:p>
+        </w:tc>
+        <w:tc>
+          <w:tcPr>
+            <w:tcW w:type="dxa" w:w="3600"/>
+          </w:tcPr>
+          <w:p>
+            <w:r>
+              <w:t>Per-job budget/labor/submittal dashboard</w:t>
             </w:r>
           </w:p>
         </w:tc>
@@ -3143,7 +3264,7 @@
                 <w:sz w:val="20"/>
                 <w:szCs w:val="20"/>
               </w:rPr>
-              <w:t xml:space="preserve">#</w:t>
+              <w:t>#</w:t>
             </w:r>
           </w:p>
         </w:tc>
@@ -3174,7 +3295,7 @@
                 <w:sz w:val="20"/>
                 <w:szCs w:val="20"/>
               </w:rPr>
-              <w:t xml:space="preserve">Stage</w:t>
+              <w:t>Stage</w:t>
             </w:r>
           </w:p>
         </w:tc>
@@ -3205,7 +3326,7 @@
                 <w:sz w:val="20"/>
                 <w:szCs w:val="20"/>
               </w:rPr>
-              <w:t xml:space="preserve">Tool</w:t>
+              <w:t>Tool</w:t>
             </w:r>
           </w:p>
         </w:tc>
@@ -3236,7 +3357,7 @@
                 <w:sz w:val="20"/>
                 <w:szCs w:val="20"/>
               </w:rPr>
-              <w:t xml:space="preserve">Output</w:t>
+              <w:t>Output</w:t>
             </w:r>
           </w:p>
         </w:tc>
@@ -3267,7 +3388,7 @@
                 <w:sz w:val="20"/>
                 <w:szCs w:val="20"/>
               </w:rPr>
-              <w:t xml:space="preserve">1</w:t>
+              <w:t>1</w:t>
             </w:r>
           </w:p>
         </w:tc>
@@ -3296,7 +3417,7 @@
                 <w:sz w:val="20"/>
                 <w:szCs w:val="20"/>
               </w:rPr>
-              <w:t xml:space="preserve">Physical Link ID (passive)</w:t>
+              <w:t>Physical Link ID (passive)</w:t>
             </w:r>
           </w:p>
         </w:tc>
@@ -3325,7 +3446,7 @@
                 <w:sz w:val="20"/>
                 <w:szCs w:val="20"/>
               </w:rPr>
-              <w:t xml:space="preserve">ethernet-link-analyzer (Scapy)</w:t>
+              <w:t>ethernet-link-analyzer (Scapy, zero-transmit)</w:t>
             </w:r>
           </w:p>
         </w:tc>
@@ -3354,7 +3475,7 @@
                 <w:sz w:val="20"/>
                 <w:szCs w:val="20"/>
               </w:rPr>
-              <w:t xml:space="preserve">Switch/port/VLAN identification</w:t>
+              <w:t>Switch/port/VLAN/voice-VLAN identification</w:t>
             </w:r>
           </w:p>
         </w:tc>
@@ -3385,7 +3506,7 @@
                 <w:sz w:val="20"/>
                 <w:szCs w:val="20"/>
               </w:rPr>
-              <w:t xml:space="preserve">2</w:t>
+              <w:t>2</w:t>
             </w:r>
           </w:p>
         </w:tc>
@@ -3414,7 +3535,7 @@
                 <w:sz w:val="20"/>
                 <w:szCs w:val="20"/>
               </w:rPr>
-              <w:t xml:space="preserve">Bulk PRTG Device Import</w:t>
+              <w:t>Active Network Scan</w:t>
             </w:r>
           </w:p>
         </w:tc>
@@ -3443,7 +3564,7 @@
                 <w:sz w:val="20"/>
                 <w:szCs w:val="20"/>
               </w:rPr>
-              <w:t xml:space="preserve">PRTG Import (PowerShell)</w:t>
+              <w:t>network-scanner (nmap/netmiko, safe OT profile)</w:t>
             </w:r>
           </w:p>
         </w:tc>
@@ -3472,7 +3593,7 @@
                 <w:sz w:val="20"/>
                 <w:szCs w:val="20"/>
               </w:rPr>
-              <w:t xml:space="preserve">PRTG group/device/tag configuration</w:t>
+              <w:t>Device/port/service inventory, switch topology</w:t>
             </w:r>
           </w:p>
         </w:tc>
@@ -3503,7 +3624,7 @@
                 <w:sz w:val="20"/>
                 <w:szCs w:val="20"/>
               </w:rPr>
-              <w:t xml:space="preserve">3</w:t>
+              <w:t>3</w:t>
             </w:r>
           </w:p>
         </w:tc>
@@ -3532,7 +3653,7 @@
                 <w:sz w:val="20"/>
                 <w:szCs w:val="20"/>
               </w:rPr>
-              <w:t xml:space="preserve">Active Network Scan</w:t>
+              <w:t>BACnet Enumeration</w:t>
             </w:r>
           </w:p>
         </w:tc>
@@ -3561,7 +3682,7 @@
                 <w:sz w:val="20"/>
                 <w:szCs w:val="20"/>
               </w:rPr>
-              <w:t xml:space="preserve">network-scanner (nmap/netmiko)</w:t>
+              <w:t>network-scanner (Who-Is / ReadProperty)</w:t>
             </w:r>
           </w:p>
         </w:tc>
@@ -3590,7 +3711,7 @@
                 <w:sz w:val="20"/>
                 <w:szCs w:val="20"/>
               </w:rPr>
-              <w:t xml:space="preserve">Device/port/service inventory, switch topology</w:t>
+              <w:t>BACnet device identity + per-object catalog</w:t>
             </w:r>
           </w:p>
         </w:tc>
@@ -3621,7 +3742,7 @@
                 <w:sz w:val="20"/>
                 <w:szCs w:val="20"/>
               </w:rPr>
-              <w:t xml:space="preserve">4</w:t>
+              <w:t>4</w:t>
             </w:r>
           </w:p>
         </w:tc>
@@ -3650,7 +3771,7 @@
                 <w:sz w:val="20"/>
                 <w:szCs w:val="20"/>
               </w:rPr>
-              <w:t xml:space="preserve">BACnet Enumeration</w:t>
+              <w:t>RMF Risk Register</w:t>
             </w:r>
           </w:p>
         </w:tc>
@@ -3679,7 +3800,7 @@
                 <w:sz w:val="20"/>
                 <w:szCs w:val="20"/>
               </w:rPr>
-              <w:t xml:space="preserve">network-scanner (bacpypes3)</w:t>
+              <w:t>network-scanner (YAML CVE matching, NIST 800-53 grouping)</w:t>
             </w:r>
           </w:p>
         </w:tc>
@@ -3708,7 +3829,7 @@
                 <w:sz w:val="20"/>
                 <w:szCs w:val="20"/>
               </w:rPr>
-              <w:t xml:space="preserve">BACnet device/object/point list</w:t>
+              <w:t>Auditor-facing RMF markdown report + findings page</w:t>
             </w:r>
           </w:p>
         </w:tc>
@@ -3739,7 +3860,7 @@
                 <w:sz w:val="20"/>
                 <w:szCs w:val="20"/>
               </w:rPr>
-              <w:t xml:space="preserve">5</w:t>
+              <w:t>5</w:t>
             </w:r>
           </w:p>
         </w:tc>
@@ -3768,7 +3889,7 @@
                 <w:sz w:val="20"/>
                 <w:szCs w:val="20"/>
               </w:rPr>
-              <w:t xml:space="preserve">Virtual Device Testing</w:t>
+              <w:t>Bulk PRTG Device Import</w:t>
             </w:r>
           </w:p>
         </w:tc>
@@ -3797,7 +3918,7 @@
                 <w:sz w:val="20"/>
                 <w:szCs w:val="20"/>
               </w:rPr>
-              <w:t xml:space="preserve">virtual-devices (bacpypes3, Docker)</w:t>
+              <w:t>prtg-import (PowerShell)</w:t>
             </w:r>
           </w:p>
         </w:tc>
@@ -3826,7 +3947,7 @@
                 <w:sz w:val="20"/>
                 <w:szCs w:val="20"/>
               </w:rPr>
-              <w:t xml:space="preserve">Simulated 76-device BAS fleet for scanner testing</w:t>
+              <w:t>PRTG group/device/tag configuration</w:t>
             </w:r>
           </w:p>
         </w:tc>
@@ -3857,7 +3978,7 @@
                 <w:sz w:val="20"/>
                 <w:szCs w:val="20"/>
               </w:rPr>
-              <w:t xml:space="preserve">6</w:t>
+              <w:t>6</w:t>
             </w:r>
           </w:p>
         </w:tc>
@@ -3886,7 +4007,7 @@
                 <w:sz w:val="20"/>
                 <w:szCs w:val="20"/>
               </w:rPr>
-              <w:t xml:space="preserve">HVAC Simulation / Training</w:t>
+              <w:t>Virtual Device Testing</w:t>
             </w:r>
           </w:p>
         </w:tc>
@@ -3915,7 +4036,7 @@
                 <w:sz w:val="20"/>
                 <w:szCs w:val="20"/>
               </w:rPr>
-              <w:t xml:space="preserve">digital-twin (BAC0, Flask)</w:t>
+              <w:t>virtual-devices (bacpypes3, Docker macvlan)</w:t>
             </w:r>
           </w:p>
         </w:tc>
@@ -3944,7 +4065,7 @@
                 <w:sz w:val="20"/>
                 <w:szCs w:val="20"/>
               </w:rPr>
-              <w:t xml:space="preserve">Fault-injection scenarios, operator training HMI</w:t>
+              <w:t>Simulated 76-device BAS fleet for scanner testing</w:t>
             </w:r>
           </w:p>
         </w:tc>
@@ -3975,7 +4096,7 @@
                 <w:sz w:val="20"/>
                 <w:szCs w:val="20"/>
               </w:rPr>
-              <w:t xml:space="preserve">7</w:t>
+              <w:t>7</w:t>
             </w:r>
           </w:p>
         </w:tc>
@@ -4004,7 +4125,7 @@
                 <w:sz w:val="20"/>
                 <w:szCs w:val="20"/>
               </w:rPr>
-              <w:t xml:space="preserve">Site KML / Topology</w:t>
+              <w:t>HVAC Simulation / Training</w:t>
             </w:r>
           </w:p>
         </w:tc>
@@ -4033,7 +4154,7 @@
                 <w:sz w:val="20"/>
                 <w:szCs w:val="20"/>
               </w:rPr>
-              <w:t xml:space="preserve">kml (JS/Python)</w:t>
+              <w:t>digital-twin — DOPPEL (BAC0, Flask)</w:t>
             </w:r>
           </w:p>
         </w:tc>
@@ -4062,7 +4183,133 @@
                 <w:sz w:val="20"/>
                 <w:szCs w:val="20"/>
               </w:rPr>
-              <w:t xml:space="preserve">Geospatial KML for JBLM site engineering</w:t>
+              <w:t>Fault-injection scenarios, operator training HMI, labeled FDD fixtures</w:t>
+            </w:r>
+          </w:p>
+        </w:tc>
+      </w:tr>
+      <w:tr>
+        <w:tc>
+          <w:tcPr>
+            <w:tcW w:type="dxa" w:w="480"/>
+          </w:tcPr>
+          <w:p>
+            <w:r>
+              <w:t>8</w:t>
+            </w:r>
+          </w:p>
+        </w:tc>
+        <w:tc>
+          <w:tcPr>
+            <w:tcW w:type="dxa" w:w="2680"/>
+          </w:tcPr>
+          <w:p>
+            <w:r>
+              <w:t>Niagara Analysis &amp; Diagnosis</w:t>
+            </w:r>
+          </w:p>
+        </w:tc>
+        <w:tc>
+          <w:tcPr>
+            <w:tcW w:type="dxa" w:w="2680"/>
+          </w:tcPr>
+          <w:p>
+            <w:r>
+              <w:t>niagara-llm — CASCADE (port 8770) on niagara-config</w:t>
+            </w:r>
+          </w:p>
+        </w:tc>
+        <w:tc>
+          <w:tcPr>
+            <w:tcW w:type="dxa" w:w="3520"/>
+          </w:tcPr>
+          <w:p>
+            <w:r>
+              <w:t>Detector findings, LLM diagnosis, Supervisor audit, backup ROI report</w:t>
+            </w:r>
+          </w:p>
+        </w:tc>
+      </w:tr>
+      <w:tr>
+        <w:tc>
+          <w:tcPr>
+            <w:tcW w:type="dxa" w:w="480"/>
+          </w:tcPr>
+          <w:p>
+            <w:r>
+              <w:t>9</w:t>
+            </w:r>
+          </w:p>
+        </w:tc>
+        <w:tc>
+          <w:tcPr>
+            <w:tcW w:type="dxa" w:w="2680"/>
+          </w:tcPr>
+          <w:p>
+            <w:r>
+              <w:t>SIEM Event Forwarding</w:t>
+            </w:r>
+          </w:p>
+        </w:tc>
+        <w:tc>
+          <w:tcPr>
+            <w:tcW w:type="dxa" w:w="2680"/>
+          </w:tcPr>
+          <w:p>
+            <w:r>
+              <w:t>siem-forwarder (Niagara 4 JACE module)</w:t>
+            </w:r>
+          </w:p>
+        </w:tc>
+        <w:tc>
+          <w:tcPr>
+            <w:tcW w:type="dxa" w:w="3520"/>
+          </w:tcPr>
+          <w:p>
+            <w:r>
+              <w:t>RFC 5424 syslog/TLS stream of point + alarm events, non-interfering (audit/platform logs are left to Niagara's native remote syslog)</w:t>
+            </w:r>
+          </w:p>
+        </w:tc>
+      </w:tr>
+      <w:tr>
+        <w:tc>
+          <w:tcPr>
+            <w:tcW w:type="dxa" w:w="480"/>
+          </w:tcPr>
+          <w:p>
+            <w:r>
+              <w:t>10</w:t>
+            </w:r>
+          </w:p>
+        </w:tc>
+        <w:tc>
+          <w:tcPr>
+            <w:tcW w:type="dxa" w:w="2680"/>
+          </w:tcPr>
+          <w:p>
+            <w:r>
+              <w:t>Site KML / Topology</w:t>
+            </w:r>
+          </w:p>
+        </w:tc>
+        <w:tc>
+          <w:tcPr>
+            <w:tcW w:type="dxa" w:w="2680"/>
+          </w:tcPr>
+          <w:p>
+            <w:r>
+              <w:t>kml (JS/Python)</w:t>
+            </w:r>
+          </w:p>
+        </w:tc>
+        <w:tc>
+          <w:tcPr>
+            <w:tcW w:type="dxa" w:w="3520"/>
+          </w:tcPr>
+          <w:p>
+            <w:r>
+              <w:t>Geospatial KML for JBLM site engineering</w:t>
             </w:r>
           </w:p>
         </w:tc>
@@ -4131,7 +4378,7 @@
           <w:sz w:val="22"/>
           <w:szCs w:val="22"/>
         </w:rPr>
-        <w:t xml:space="preserve">Python + FastAPI for all web-based tools; uv for dependency management</w:t>
+        <w:t>Python + FastAPI for most web-based tools; uv for dependency management. Exceptions: digital-twin serves its HMI from Flask, rfp-automation's dashboard is a stdlib HTTP handler, and floor-plan-editor / outlook-followup are browser- and Office.js-only with no Python backend at all</w:t>
       </w:r>
     </w:p>
     <w:p>
@@ -4188,7 +4435,7 @@
           <w:sz w:val="22"/>
           <w:szCs w:val="22"/>
         </w:rPr>
-        <w:t xml:space="preserve">Pytest as the universal test framework; 30–1800+ tests per production system</w:t>
+        <w:t>Pytest wherever there is Python, with suites ranging from 7 tests (cert-manager) to ~4,180 (rfp-automation). It is not universal: prtg-import (PowerShell), outlook-followup (JS), kml, and the design-only fulcrum-replacement have no test suite at all</w:t>
       </w:r>
     </w:p>
     <w:p>
@@ -4243,7 +4490,7 @@
           <w:sz w:val="22"/>
           <w:szCs w:val="22"/>
         </w:rPr>
-        <w:t xml:space="preserve">React + Vite + TypeScript for richer UIs (cert-manager)</w:t>
+        <w:t>React + Vite + TypeScript for richer UIs (project-tracking v2 UI, cert-manager)</w:t>
       </w:r>
     </w:p>
     <w:p>
@@ -4281,7 +4528,7 @@
           <w:sz w:val="22"/>
           <w:szCs w:val="22"/>
         </w:rPr>
-        <w:t xml:space="preserve">ssi-design-system CSS tokens applied consistently across all SSi web apps</w:t>
+        <w:t>ssi-design-system CSS tokens are the intended baseline across SSi web apps — six consumers are configured in apps.json — but the rollout is not currently consistent: sync.py is a no-op until its stale _root is fixed (see 2.2), and scribe carries a synced bundle with no apps.json entry to keep it current</w:t>
       </w:r>
     </w:p>
     <w:p>
@@ -4336,7 +4583,7 @@
           <w:sz w:val="22"/>
           <w:szCs w:val="22"/>
         </w:rPr>
-        <w:t xml:space="preserve">docx.js (Node.js) for cyber-proposals and cyber-estimates — richer formatting control</w:t>
+        <w:t>docx.js (Node.js) where richer formatting control is needed (sops SOP builder)</w:t>
       </w:r>
     </w:p>
     <w:p>
@@ -4355,7 +4602,7 @@
           <w:sz w:val="22"/>
           <w:szCs w:val="22"/>
         </w:rPr>
-        <w:t xml:space="preserve">openpyxl for Excel output (cyber-estimates, cyber-eac-tool, network-scanner reports)</w:t>
+        <w:t>openpyxl for Excel output (project-tracking Sage rollups, network-scanner reports, ssi-design-system point dictionary)</w:t>
       </w:r>
     </w:p>
     <w:p>
@@ -4391,7 +4638,7 @@
           <w:sz w:val="22"/>
           <w:szCs w:val="22"/>
         </w:rPr>
-        <w:t xml:space="preserve">Prompt caching enabled in all Claude API consumers (rfp-automation, cyber-proposals, email-processor, past-performance)</w:t>
+        <w:t>Prompt caching enabled in all Claude API consumers (rfp-automation, email-processor, past-performance, project-monitor, cyber-brain, sanguine)</w:t>
       </w:r>
     </w:p>
     <w:p>
@@ -4410,7 +4657,7 @@
           <w:sz w:val="22"/>
           <w:szCs w:val="22"/>
         </w:rPr>
-        <w:t xml:space="preserve">Primary uses: scope extraction from specs, email triage summarization, past-performance extraction/generation</w:t>
+        <w:t>Primary uses: scope extraction from specs, email triage summarization, past-performance extraction/generation, register extraction, BAS fault diagnosis</w:t>
       </w:r>
     </w:p>
     <w:p>
@@ -4429,7 +4676,7 @@
           <w:sz w:val="22"/>
           <w:szCs w:val="22"/>
         </w:rPr>
-        <w:t xml:space="preserve">All API calls structured with defined system prompts and typed output schemas where possible</w:t>
+        <w:t>All API calls structured with defined system prompts and typed output schemas where possible; local Ollama replaces the cloud API where CUI or air-gapped operation requires it (niagara-llm, scribe, rfp-automation amendment review)</w:t>
       </w:r>
     </w:p>
     <w:p>
@@ -4503,7 +4750,7 @@
           <w:sz w:val="22"/>
           <w:szCs w:val="22"/>
         </w:rPr>
-        <w:t xml:space="preserve">Scapy / libpcap — passive packet capture (ethernet-link-analyzer, Pocket Probe simulator)</w:t>
+        <w:t>Scapy / libpcap — passive packet capture (ethernet-link-analyzer, pocket-probe simulator)</w:t>
       </w:r>
     </w:p>
     <w:p>
@@ -4577,7 +4824,7 @@
           <w:sz w:val="22"/>
           <w:szCs w:val="22"/>
         </w:rPr>
-        <w:t xml:space="preserve">OneDrive for email-processor vault sync between machines (CMMC-compliant, no Graph API)</w:t>
+        <w:t>OneDrive for email-processor vault sync between machines (CMMC-compliant, no Graph API)</w:t>
       </w:r>
     </w:p>
     <w:p>
@@ -4675,7 +4922,7 @@
                 <w:sz w:val="20"/>
                 <w:szCs w:val="20"/>
               </w:rPr>
-              <w:t xml:space="preserve">Project</w:t>
+              <w:t>Project</w:t>
             </w:r>
           </w:p>
         </w:tc>
@@ -4706,7 +4953,7 @@
                 <w:sz w:val="20"/>
                 <w:szCs w:val="20"/>
               </w:rPr>
-              <w:t xml:space="preserve">Uses account-store</w:t>
+              <w:t>Uses account-store</w:t>
             </w:r>
           </w:p>
         </w:tc>
@@ -4737,7 +4984,7 @@
                 <w:sz w:val="20"/>
                 <w:szCs w:val="20"/>
               </w:rPr>
-              <w:t xml:space="preserve">Uses ssi-design-system</w:t>
+              <w:t>Uses ssi-design-system</w:t>
             </w:r>
           </w:p>
         </w:tc>
@@ -4768,7 +5015,7 @@
                 <w:sz w:val="20"/>
                 <w:szCs w:val="20"/>
               </w:rPr>
-              <w:t xml:space="preserve">Uses cyber-proposals</w:t>
+              <w:t>Uses niagara-config</w:t>
             </w:r>
           </w:p>
         </w:tc>
@@ -4801,7 +5048,7 @@
                 <w:sz w:val="20"/>
                 <w:szCs w:val="20"/>
               </w:rPr>
-              <w:t xml:space="preserve">rfp-automation</w:t>
+              <w:t>rfp-automation</w:t>
             </w:r>
           </w:p>
         </w:tc>
@@ -4830,7 +5077,7 @@
                 <w:sz w:val="20"/>
                 <w:szCs w:val="20"/>
               </w:rPr>
-              <w:t xml:space="preserve">✓</w:t>
+              <w:t>✓</w:t>
             </w:r>
           </w:p>
         </w:tc>
@@ -4859,7 +5106,7 @@
                 <w:sz w:val="20"/>
                 <w:szCs w:val="20"/>
               </w:rPr>
-              <w:t xml:space="preserve">—</w:t>
+              <w:t>✓</w:t>
             </w:r>
           </w:p>
         </w:tc>
@@ -4888,7 +5135,7 @@
                 <w:sz w:val="20"/>
                 <w:szCs w:val="20"/>
               </w:rPr>
-              <w:t xml:space="preserve">✓ (adapter)</w:t>
+              <w:t>—</w:t>
             </w:r>
           </w:p>
         </w:tc>
@@ -4921,7 +5168,7 @@
                 <w:sz w:val="20"/>
                 <w:szCs w:val="20"/>
               </w:rPr>
-              <w:t xml:space="preserve">project-tracking</w:t>
+              <w:t>project-tracking</w:t>
             </w:r>
           </w:p>
         </w:tc>
@@ -4950,7 +5197,7 @@
                 <w:sz w:val="20"/>
                 <w:szCs w:val="20"/>
               </w:rPr>
-              <w:t xml:space="preserve">✓</w:t>
+              <w:t>✓</w:t>
             </w:r>
           </w:p>
         </w:tc>
@@ -4979,7 +5226,7 @@
                 <w:sz w:val="20"/>
                 <w:szCs w:val="20"/>
               </w:rPr>
-              <w:t xml:space="preserve">✓ (pilot)</w:t>
+              <w:t>✓ (pilot)</w:t>
             </w:r>
           </w:p>
         </w:tc>
@@ -5008,7 +5255,7 @@
                 <w:sz w:val="20"/>
                 <w:szCs w:val="20"/>
               </w:rPr>
-              <w:t xml:space="preserve">—</w:t>
+              <w:t>—</w:t>
             </w:r>
           </w:p>
         </w:tc>
@@ -5041,7 +5288,7 @@
                 <w:sz w:val="20"/>
                 <w:szCs w:val="20"/>
               </w:rPr>
-              <w:t xml:space="preserve">email-processor</w:t>
+              <w:t>email-processor</w:t>
             </w:r>
           </w:p>
         </w:tc>
@@ -5070,7 +5317,7 @@
                 <w:sz w:val="20"/>
                 <w:szCs w:val="20"/>
               </w:rPr>
-              <w:t xml:space="preserve">✓</w:t>
+              <w:t>✓</w:t>
             </w:r>
           </w:p>
         </w:tc>
@@ -5099,7 +5346,7 @@
                 <w:sz w:val="20"/>
                 <w:szCs w:val="20"/>
               </w:rPr>
-              <w:t xml:space="preserve">—</w:t>
+              <w:t>✓</w:t>
             </w:r>
           </w:p>
         </w:tc>
@@ -5128,7 +5375,7 @@
                 <w:sz w:val="20"/>
                 <w:szCs w:val="20"/>
               </w:rPr>
-              <w:t xml:space="preserve">—</w:t>
+              <w:t>—</w:t>
             </w:r>
           </w:p>
         </w:tc>
@@ -5161,7 +5408,7 @@
                 <w:sz w:val="20"/>
                 <w:szCs w:val="20"/>
               </w:rPr>
-              <w:t xml:space="preserve">cyber-estimates</w:t>
+              <w:t>past-performance</w:t>
             </w:r>
           </w:p>
         </w:tc>
@@ -5190,7 +5437,7 @@
                 <w:sz w:val="20"/>
                 <w:szCs w:val="20"/>
               </w:rPr>
-              <w:t xml:space="preserve">—</w:t>
+              <w:t>✓</w:t>
             </w:r>
           </w:p>
         </w:tc>
@@ -5219,7 +5466,7 @@
                 <w:sz w:val="20"/>
                 <w:szCs w:val="20"/>
               </w:rPr>
-              <w:t xml:space="preserve">—</w:t>
+              <w:t>—</w:t>
             </w:r>
           </w:p>
         </w:tc>
@@ -5248,7 +5495,7 @@
                 <w:sz w:val="20"/>
                 <w:szCs w:val="20"/>
               </w:rPr>
-              <w:t xml:space="preserve">✓ (direct)</w:t>
+              <w:t>—</w:t>
             </w:r>
           </w:p>
         </w:tc>
@@ -5281,7 +5528,7 @@
                 <w:sz w:val="20"/>
                 <w:szCs w:val="20"/>
               </w:rPr>
-              <w:t xml:space="preserve">past-performance</w:t>
+              <w:t>project-monitor</w:t>
             </w:r>
           </w:p>
         </w:tc>
@@ -5310,7 +5557,7 @@
                 <w:sz w:val="20"/>
                 <w:szCs w:val="20"/>
               </w:rPr>
-              <w:t xml:space="preserve">—</w:t>
+              <w:t>✓</w:t>
             </w:r>
           </w:p>
         </w:tc>
@@ -5339,7 +5586,7 @@
                 <w:sz w:val="20"/>
                 <w:szCs w:val="20"/>
               </w:rPr>
-              <w:t xml:space="preserve">—</w:t>
+              <w:t>—</w:t>
             </w:r>
           </w:p>
         </w:tc>
@@ -5368,7 +5615,7 @@
                 <w:sz w:val="20"/>
                 <w:szCs w:val="20"/>
               </w:rPr>
-              <w:t xml:space="preserve">—</w:t>
+              <w:t>—</w:t>
             </w:r>
           </w:p>
         </w:tc>
@@ -5401,7 +5648,7 @@
                 <w:sz w:val="20"/>
                 <w:szCs w:val="20"/>
               </w:rPr>
-              <w:t xml:space="preserve">network-scanner</w:t>
+              <w:t>cert-manager</w:t>
             </w:r>
           </w:p>
         </w:tc>
@@ -5430,7 +5677,7 @@
                 <w:sz w:val="20"/>
                 <w:szCs w:val="20"/>
               </w:rPr>
-              <w:t xml:space="preserve">—</w:t>
+              <w:t>✓</w:t>
             </w:r>
           </w:p>
         </w:tc>
@@ -5459,7 +5706,7 @@
                 <w:sz w:val="20"/>
                 <w:szCs w:val="20"/>
               </w:rPr>
-              <w:t xml:space="preserve">—</w:t>
+              <w:t>—</w:t>
             </w:r>
           </w:p>
         </w:tc>
@@ -5488,7 +5735,7 @@
                 <w:sz w:val="20"/>
                 <w:szCs w:val="20"/>
               </w:rPr>
-              <w:t xml:space="preserve">—</w:t>
+              <w:t>—</w:t>
             </w:r>
           </w:p>
         </w:tc>
@@ -5521,7 +5768,7 @@
                 <w:sz w:val="20"/>
                 <w:szCs w:val="20"/>
               </w:rPr>
-              <w:t xml:space="preserve">cert-manager</w:t>
+              <w:t>project-creation</w:t>
             </w:r>
           </w:p>
         </w:tc>
@@ -5550,7 +5797,7 @@
                 <w:sz w:val="20"/>
                 <w:szCs w:val="20"/>
               </w:rPr>
-              <w:t xml:space="preserve">—</w:t>
+              <w:t>✓</w:t>
             </w:r>
           </w:p>
         </w:tc>
@@ -5579,7 +5826,7 @@
                 <w:sz w:val="20"/>
                 <w:szCs w:val="20"/>
               </w:rPr>
-              <w:t xml:space="preserve">—</w:t>
+              <w:t>—</w:t>
             </w:r>
           </w:p>
         </w:tc>
@@ -5608,7 +5855,7 @@
                 <w:sz w:val="20"/>
                 <w:szCs w:val="20"/>
               </w:rPr>
-              <w:t xml:space="preserve">—</w:t>
+              <w:t>—</w:t>
             </w:r>
           </w:p>
         </w:tc>
@@ -5641,7 +5888,7 @@
                 <w:sz w:val="20"/>
                 <w:szCs w:val="20"/>
               </w:rPr>
-              <w:t xml:space="preserve">project-monitor</w:t>
+              <w:t>digital-twin</w:t>
             </w:r>
           </w:p>
         </w:tc>
@@ -5670,7 +5917,7 @@
                 <w:sz w:val="20"/>
                 <w:szCs w:val="20"/>
               </w:rPr>
-              <w:t xml:space="preserve">✓</w:t>
+              <w:t>✓</w:t>
             </w:r>
           </w:p>
         </w:tc>
@@ -5699,7 +5946,7 @@
                 <w:sz w:val="20"/>
                 <w:szCs w:val="20"/>
               </w:rPr>
-              <w:t xml:space="preserve">—</w:t>
+              <w:t>✓</w:t>
             </w:r>
           </w:p>
         </w:tc>
@@ -5728,7 +5975,91 @@
                 <w:sz w:val="20"/>
                 <w:szCs w:val="20"/>
               </w:rPr>
-              <w:t xml:space="preserve">—</w:t>
+              <w:t>✓</w:t>
+            </w:r>
+          </w:p>
+        </w:tc>
+      </w:tr>
+      <w:tr>
+        <w:tc>
+          <w:tcPr>
+            <w:tcW w:type="dxa" w:w="2400"/>
+          </w:tcPr>
+          <w:p>
+            <w:r>
+              <w:t>niagara-llm</w:t>
+            </w:r>
+          </w:p>
+        </w:tc>
+        <w:tc>
+          <w:tcPr>
+            <w:tcW w:type="dxa" w:w="2160"/>
+          </w:tcPr>
+          <w:p>
+            <w:r>
+              <w:t>—</w:t>
+            </w:r>
+          </w:p>
+        </w:tc>
+        <w:tc>
+          <w:tcPr>
+            <w:tcW w:type="dxa" w:w="2400"/>
+          </w:tcPr>
+          <w:p>
+            <w:r>
+              <w:t>—</w:t>
+            </w:r>
+          </w:p>
+        </w:tc>
+        <w:tc>
+          <w:tcPr>
+            <w:tcW w:type="dxa" w:w="2400"/>
+          </w:tcPr>
+          <w:p>
+            <w:r>
+              <w:t>✓ (via re-export shims)</w:t>
+            </w:r>
+          </w:p>
+        </w:tc>
+      </w:tr>
+      <w:tr>
+        <w:tc>
+          <w:tcPr>
+            <w:tcW w:type="dxa" w:w="2400"/>
+          </w:tcPr>
+          <w:p>
+            <w:r>
+              <w:t>cyber-artifact-gen</w:t>
+            </w:r>
+          </w:p>
+        </w:tc>
+        <w:tc>
+          <w:tcPr>
+            <w:tcW w:type="dxa" w:w="2160"/>
+          </w:tcPr>
+          <w:p>
+            <w:r>
+              <w:t>—</w:t>
+            </w:r>
+          </w:p>
+        </w:tc>
+        <w:tc>
+          <w:tcPr>
+            <w:tcW w:type="dxa" w:w="2400"/>
+          </w:tcPr>
+          <w:p>
+            <w:r>
+              <w:t>✓ (data-level only)</w:t>
+            </w:r>
+          </w:p>
+        </w:tc>
+        <w:tc>
+          <w:tcPr>
+            <w:tcW w:type="dxa" w:w="2400"/>
+          </w:tcPr>
+          <w:p>
+            <w:r>
+              <w:t>—</w:t>
             </w:r>
           </w:p>
         </w:tc>
@@ -5769,7 +6100,7 @@
           <w:sz w:val="22"/>
           <w:szCs w:val="22"/>
         </w:rPr>
-        <w:t xml:space="preserve">virtual-devices → network-scanner: </w:t>
+        <w:t>virtual-devices → network-scanner: virtual-devices runs a macvlan Docker fleet that network-scanner targets for integration testing against a realistic BAS environment.</w:t>
       </w:r>
       <w:r>
         <w:rPr>
@@ -5778,7 +6109,6 @@
           <w:sz w:val="22"/>
           <w:szCs w:val="22"/>
         </w:rPr>
-        <w:t xml:space="preserve">virtual-devices runs a macvlan Docker fleet that network-scanner targets for integration testing against a realistic BAS environment.</w:t>
       </w:r>
     </w:p>
     <w:p>
@@ -5794,7 +6124,7 @@
           <w:sz w:val="22"/>
           <w:szCs w:val="22"/>
         </w:rPr>
-        <w:t xml:space="preserve">digital-twin → (manual): </w:t>
+        <w:t>digital-twin → niagara-llm: the twin's Niagara oBIX/REST-BQL emulation layer is niagara-llm's development target, and its FaultEngine is the test oracle. Separately, the twin's `config export-fixtures` labeled diagnosis fixtures feed niagara-llm's diag-score offline scorer — JSON files are the whole contract, so there is no live server and no runtime dependency between the two repos.</w:t>
       </w:r>
       <w:r>
         <w:rPr>
@@ -5803,7 +6133,6 @@
           <w:sz w:val="22"/>
           <w:szCs w:val="22"/>
         </w:rPr>
-        <w:t xml:space="preserve">digital-twin is a self-contained BACnet test target. Any bacpypes3-based tool can target it for live BACnet testing on ARM Mac without Docker.</w:t>
       </w:r>
     </w:p>
     <w:p>
@@ -5819,7 +6148,7 @@
           <w:sz w:val="22"/>
           <w:szCs w:val="22"/>
         </w:rPr>
-        <w:t xml:space="preserve">email-processor → past-performance: </w:t>
+        <w:t>rfp-automation → project-creation: project-creation takes both account-store and rfp-automation as sibling path dependencies, so it needs both checked out beside it. Still planned: email-processor querying past-performance's index when triaging new solicitations.</w:t>
       </w:r>
       <w:r>
         <w:rPr>
@@ -5828,7 +6157,6 @@
           <w:sz w:val="22"/>
           <w:szCs w:val="22"/>
         </w:rPr>
-        <w:t xml:space="preserve">Planned: email-processor to query past-performance FTS5 index when triaging new solicitations to surface relevant experience.</w:t>
       </w:r>
     </w:p>
     <w:p>
@@ -5911,7 +6239,7 @@
                 <w:sz w:val="20"/>
                 <w:szCs w:val="20"/>
               </w:rPr>
-              <w:t xml:space="preserve">Port</w:t>
+              <w:t>Port</w:t>
             </w:r>
           </w:p>
         </w:tc>
@@ -5942,7 +6270,7 @@
                 <w:sz w:val="20"/>
                 <w:szCs w:val="20"/>
               </w:rPr>
-              <w:t xml:space="preserve">Project</w:t>
+              <w:t>Project</w:t>
             </w:r>
           </w:p>
         </w:tc>
@@ -5973,7 +6301,7 @@
                 <w:sz w:val="20"/>
                 <w:szCs w:val="20"/>
               </w:rPr>
-              <w:t xml:space="preserve">Description</w:t>
+              <w:t>Description</w:t>
             </w:r>
           </w:p>
         </w:tc>
@@ -6004,7 +6332,7 @@
                 <w:sz w:val="20"/>
                 <w:szCs w:val="20"/>
               </w:rPr>
-              <w:t xml:space="preserve">8000</w:t>
+              <w:t>443</w:t>
             </w:r>
           </w:p>
         </w:tc>
@@ -6035,7 +6363,7 @@
                 <w:sz w:val="20"/>
                 <w:szCs w:val="20"/>
               </w:rPr>
-              <w:t xml:space="preserve">network-scanner</w:t>
+              <w:t>project-tracking</w:t>
             </w:r>
           </w:p>
         </w:tc>
@@ -6064,7 +6392,7 @@
                 <w:sz w:val="20"/>
                 <w:szCs w:val="20"/>
               </w:rPr>
-              <w:t xml:space="preserve">Site-based network discovery; FastAPI backend + web UI</w:t>
+              <w:t>Job financial dashboard; uvicorn terminates TLS directly (mkcert), no reverse proxy. Cutover complete 2026-07-06; the old plaintext :8768 endpoint is retired.</w:t>
             </w:r>
           </w:p>
         </w:tc>
@@ -6095,7 +6423,7 @@
                 <w:sz w:val="20"/>
                 <w:szCs w:val="20"/>
               </w:rPr>
-              <w:t xml:space="preserve">8002</w:t>
+              <w:t>5173</w:t>
             </w:r>
           </w:p>
         </w:tc>
@@ -6126,7 +6454,7 @@
                 <w:sz w:val="20"/>
                 <w:szCs w:val="20"/>
               </w:rPr>
-              <w:t xml:space="preserve">cert-manager</w:t>
+              <w:t>cert-manager</w:t>
             </w:r>
           </w:p>
         </w:tc>
@@ -6155,7 +6483,7 @@
                 <w:sz w:val="20"/>
                 <w:szCs w:val="20"/>
               </w:rPr>
-              <w:t xml:space="preserve">Cert management backend; FastAPI (React/Vite frontend on 5173)</w:t>
+              <w:t>Vite dev frontend; proxies /api → backend on 8002</w:t>
             </w:r>
           </w:p>
         </w:tc>
@@ -6186,7 +6514,7 @@
                 <w:sz w:val="20"/>
                 <w:szCs w:val="20"/>
               </w:rPr>
-              <w:t xml:space="preserve">8008</w:t>
+              <w:t>8000</w:t>
             </w:r>
           </w:p>
         </w:tc>
@@ -6217,7 +6545,7 @@
                 <w:sz w:val="20"/>
                 <w:szCs w:val="20"/>
               </w:rPr>
-              <w:t xml:space="preserve">rfp-automation</w:t>
+              <w:t>network-scanner</w:t>
             </w:r>
           </w:p>
         </w:tc>
@@ -6246,7 +6574,7 @@
                 <w:sz w:val="20"/>
                 <w:szCs w:val="20"/>
               </w:rPr>
-              <w:t xml:space="preserve">RFP triage + proposal generation dashboard; stdlib HTTP; reads RFP_DASHBOARD_PORT from .env</w:t>
+              <w:t>RMF BAS audit tool; FastAPI + web UI. Start via .venv/bin/python -m uvicorn (the console script has a stale shebang)</w:t>
             </w:r>
           </w:p>
         </w:tc>
@@ -6277,7 +6605,7 @@
                 <w:sz w:val="20"/>
                 <w:szCs w:val="20"/>
               </w:rPr>
-              <w:t xml:space="preserve">8010</w:t>
+              <w:t>8002</w:t>
             </w:r>
           </w:p>
         </w:tc>
@@ -6308,7 +6636,7 @@
                 <w:sz w:val="20"/>
                 <w:szCs w:val="20"/>
               </w:rPr>
-              <w:t xml:space="preserve">cyber-eac-tool</w:t>
+              <w:t>cert-manager</w:t>
             </w:r>
           </w:p>
         </w:tc>
@@ -6337,7 +6665,7 @@
                 <w:sz w:val="20"/>
                 <w:szCs w:val="20"/>
               </w:rPr>
-              <w:t xml:space="preserve">Earned-value calculator; localhost only; manual start via serve.py</w:t>
+              <w:t>Cert management backend; FastAPI (React/Vite frontend on 5173)</w:t>
             </w:r>
           </w:p>
         </w:tc>
@@ -6368,7 +6696,7 @@
                 <w:sz w:val="20"/>
                 <w:szCs w:val="20"/>
               </w:rPr>
-              <w:t xml:space="preserve">8080</w:t>
+              <w:t>8008</w:t>
             </w:r>
           </w:p>
         </w:tc>
@@ -6399,7 +6727,7 @@
                 <w:sz w:val="20"/>
                 <w:szCs w:val="20"/>
               </w:rPr>
-              <w:t xml:space="preserve">digital-twin</w:t>
+              <w:t>rfp-automation</w:t>
             </w:r>
           </w:p>
         </w:tc>
@@ -6428,7 +6756,7 @@
                 <w:sz w:val="20"/>
                 <w:szCs w:val="20"/>
               </w:rPr>
-              <w:t xml:space="preserve">HVAC HMI; Flask; localhost only (WEB_HMI_PORT)</w:t>
+              <w:t>RFP triage + proposal generation dashboard; stdlib HTTP; reads RFP_DASHBOARD_PORT from .env</w:t>
             </w:r>
           </w:p>
         </w:tc>
@@ -6459,7 +6787,7 @@
                 <w:sz w:val="20"/>
                 <w:szCs w:val="20"/>
               </w:rPr>
-              <w:t xml:space="preserve">8081</w:t>
+              <w:t>8080</w:t>
             </w:r>
           </w:p>
         </w:tc>
@@ -6490,7 +6818,7 @@
                 <w:sz w:val="20"/>
                 <w:szCs w:val="20"/>
               </w:rPr>
-              <w:t xml:space="preserve">digital-twin</w:t>
+              <w:t>digital-twin</w:t>
             </w:r>
           </w:p>
         </w:tc>
@@ -6519,7 +6847,7 @@
                 <w:sz w:val="20"/>
                 <w:szCs w:val="20"/>
               </w:rPr>
-              <w:t xml:space="preserve">Niagara oBIX server (emulator); gated by TWIN_ENABLE_NIAGARA=1</w:t>
+              <w:t>HVAC HMI (DOPPEL); Flask (WEB_HMI_PORT)</w:t>
             </w:r>
           </w:p>
         </w:tc>
@@ -6550,7 +6878,7 @@
                 <w:sz w:val="20"/>
                 <w:szCs w:val="20"/>
               </w:rPr>
-              <w:t xml:space="preserve">8082</w:t>
+              <w:t>8081</w:t>
             </w:r>
           </w:p>
         </w:tc>
@@ -6581,7 +6909,7 @@
                 <w:sz w:val="20"/>
                 <w:szCs w:val="20"/>
               </w:rPr>
-              <w:t xml:space="preserve">digital-twin</w:t>
+              <w:t>digital-twin</w:t>
             </w:r>
           </w:p>
         </w:tc>
@@ -6610,7 +6938,7 @@
                 <w:sz w:val="20"/>
                 <w:szCs w:val="20"/>
               </w:rPr>
-              <w:t xml:space="preserve">Niagara REST/BQL endpoint (emulator); same process as oBIX (NIAGARA_BQL_PORT)</w:t>
+              <w:t>Niagara oBIX server (emulator); gated by TWIN_ENABLE_NIAGARA=1</w:t>
             </w:r>
           </w:p>
         </w:tc>
@@ -6641,7 +6969,7 @@
                 <w:sz w:val="20"/>
                 <w:szCs w:val="20"/>
               </w:rPr>
-              <w:t xml:space="preserve">8736</w:t>
+              <w:t>8082</w:t>
             </w:r>
           </w:p>
         </w:tc>
@@ -6672,7 +7000,7 @@
                 <w:sz w:val="20"/>
                 <w:szCs w:val="20"/>
               </w:rPr>
-              <w:t xml:space="preserve">scribe</w:t>
+              <w:t>digital-twin</w:t>
             </w:r>
           </w:p>
         </w:tc>
@@ -6701,7 +7029,7 @@
                 <w:sz w:val="20"/>
                 <w:szCs w:val="20"/>
               </w:rPr>
-              <w:t xml:space="preserve">SSI Scribe meeting note taker; FastAPI + uvicorn; launchd service</w:t>
+              <w:t>Niagara REST/BQL endpoint (emulator); same process as oBIX (NIAGARA_BQL_PORT)</w:t>
             </w:r>
           </w:p>
         </w:tc>
@@ -6732,7 +7060,7 @@
                 <w:sz w:val="20"/>
                 <w:szCs w:val="20"/>
               </w:rPr>
-              <w:t xml:space="preserve">8765</w:t>
+              <w:t>8736</w:t>
             </w:r>
           </w:p>
         </w:tc>
@@ -6763,7 +7091,7 @@
                 <w:sz w:val="20"/>
                 <w:szCs w:val="20"/>
               </w:rPr>
-              <w:t xml:space="preserve">email-processor</w:t>
+              <w:t>scribe</w:t>
             </w:r>
           </w:p>
         </w:tc>
@@ -6792,7 +7120,7 @@
                 <w:sz w:val="20"/>
                 <w:szCs w:val="20"/>
               </w:rPr>
-              <w:t xml:space="preserve">Dashboard webserver; FastAPI + auth; OneDrive sync</w:t>
+              <w:t>SSI Scribe meeting note taker; uvicorn terminates TLS directly (mkcert); launchd service</w:t>
             </w:r>
           </w:p>
         </w:tc>
@@ -6823,7 +7151,7 @@
                 <w:sz w:val="20"/>
                 <w:szCs w:val="20"/>
               </w:rPr>
-              <w:t xml:space="preserve">8767</w:t>
+              <w:t>8737</w:t>
             </w:r>
           </w:p>
         </w:tc>
@@ -6854,7 +7182,7 @@
                 <w:sz w:val="20"/>
                 <w:szCs w:val="20"/>
               </w:rPr>
-              <w:t xml:space="preserve">past-performance</w:t>
+              <w:t>dev-portfolio</w:t>
             </w:r>
           </w:p>
         </w:tc>
@@ -6883,7 +7211,7 @@
                 <w:sz w:val="20"/>
                 <w:szCs w:val="20"/>
               </w:rPr>
-              <w:t xml:space="preserve">PP search portal; FastAPI; single-user v1</w:t>
+              <w:t>Portfolio index dashboard; plain HTTP ThreadingHTTPServer, no TLS despite the cert env vars being set (see PORTS.md)</w:t>
             </w:r>
           </w:p>
         </w:tc>
@@ -6914,7 +7242,7 @@
                 <w:sz w:val="20"/>
                 <w:szCs w:val="20"/>
               </w:rPr>
-              <w:t xml:space="preserve">8768</w:t>
+              <w:t>8765</w:t>
             </w:r>
           </w:p>
         </w:tc>
@@ -6945,7 +7273,7 @@
                 <w:sz w:val="20"/>
                 <w:szCs w:val="20"/>
               </w:rPr>
-              <w:t xml:space="preserve">project-tracking</w:t>
+              <w:t>email-processor</w:t>
             </w:r>
           </w:p>
         </w:tc>
@@ -6974,7 +7302,7 @@
                 <w:sz w:val="20"/>
                 <w:szCs w:val="20"/>
               </w:rPr>
-              <w:t xml:space="preserve">Job financial dashboard; FastAPI + session-cookie auth (PT_PORT)</w:t>
+              <w:t>Dashboard webserver; FastAPI + auth; OneDrive sync. Use make serve, not a bare uv run</w:t>
             </w:r>
           </w:p>
         </w:tc>
@@ -7005,7 +7333,7 @@
                 <w:sz w:val="20"/>
                 <w:szCs w:val="20"/>
               </w:rPr>
-              <w:t xml:space="preserve">8769</w:t>
+              <w:t>8767</w:t>
             </w:r>
           </w:p>
         </w:tc>
@@ -7036,7 +7364,7 @@
                 <w:sz w:val="20"/>
                 <w:szCs w:val="20"/>
               </w:rPr>
-              <w:t xml:space="preserve">project-monitor</w:t>
+              <w:t>past-performance</w:t>
             </w:r>
           </w:p>
         </w:tc>
@@ -7065,7 +7393,7 @@
                 <w:sz w:val="20"/>
                 <w:szCs w:val="20"/>
               </w:rPr>
-              <w:t xml:space="preserve">PM status dashboard via entity registers; FastAPI (PM_PORT)</w:t>
+              <w:t>PP search, extraction, and generation portal; FastAPI</w:t>
             </w:r>
           </w:p>
         </w:tc>
@@ -7096,7 +7424,7 @@
                 <w:sz w:val="20"/>
                 <w:szCs w:val="20"/>
               </w:rPr>
-              <w:t xml:space="preserve">8770</w:t>
+              <w:t>8769</w:t>
             </w:r>
           </w:p>
         </w:tc>
@@ -7127,7 +7455,7 @@
                 <w:sz w:val="20"/>
                 <w:szCs w:val="20"/>
               </w:rPr>
-              <w:t xml:space="preserve">niagara-llm</w:t>
+              <w:t>project-monitor</w:t>
             </w:r>
           </w:p>
         </w:tc>
@@ -7156,7 +7484,7 @@
                 <w:sz w:val="20"/>
                 <w:szCs w:val="20"/>
               </w:rPr>
-              <w:t xml:space="preserve">CASCADE Niagara analysis brain; FastAPI + dashboard</w:t>
+              <w:t>PM status dashboard via entity registers; FastAPI (PM_PORT)</w:t>
             </w:r>
           </w:p>
         </w:tc>
@@ -7187,7 +7515,7 @@
                 <w:sz w:val="20"/>
                 <w:szCs w:val="20"/>
               </w:rPr>
-              <w:t xml:space="preserve">8771</w:t>
+              <w:t>8770</w:t>
             </w:r>
           </w:p>
         </w:tc>
@@ -7218,7 +7546,7 @@
                 <w:sz w:val="20"/>
                 <w:szCs w:val="20"/>
               </w:rPr>
-              <w:t xml:space="preserve">sanguine</w:t>
+              <w:t>niagara-llm</w:t>
             </w:r>
           </w:p>
         </w:tc>
@@ -7247,7 +7575,7 @@
                 <w:sz w:val="20"/>
                 <w:szCs w:val="20"/>
               </w:rPr>
-              <w:t xml:space="preserve">Blood-lab results viewer; FastAPI + dashboard (SANGUINE_PORT)</w:t>
+              <w:t>CASCADE Niagara analysis brain; FastAPI + dashboard</w:t>
             </w:r>
           </w:p>
         </w:tc>
@@ -7278,7 +7606,7 @@
                 <w:sz w:val="20"/>
                 <w:szCs w:val="20"/>
               </w:rPr>
-              <w:t xml:space="preserve">8772</w:t>
+              <w:t>8771</w:t>
             </w:r>
           </w:p>
         </w:tc>
@@ -7309,7 +7637,7 @@
                 <w:sz w:val="20"/>
                 <w:szCs w:val="20"/>
               </w:rPr>
-              <w:t xml:space="preserve">cyber-brain</w:t>
+              <w:t>sanguine</w:t>
             </w:r>
           </w:p>
         </w:tc>
@@ -7338,7 +7666,7 @@
                 <w:sz w:val="20"/>
                 <w:szCs w:val="20"/>
               </w:rPr>
-              <w:t xml:space="preserve">Cyber group knowledge system; FastAPI + dashboard; binds 127.0.0.1 by default</w:t>
+              <w:t>Blood-lab results viewer; FastAPI + dashboard (SANGUINE_PORT)</w:t>
             </w:r>
           </w:p>
         </w:tc>
@@ -7369,7 +7697,7 @@
                 <w:sz w:val="20"/>
                 <w:szCs w:val="20"/>
               </w:rPr>
-              <w:t xml:space="preserve">5173</w:t>
+              <w:t>8772</w:t>
             </w:r>
           </w:p>
         </w:tc>
@@ -7400,7 +7728,7 @@
                 <w:sz w:val="20"/>
                 <w:szCs w:val="20"/>
               </w:rPr>
-              <w:t xml:space="preserve">cert-manager</w:t>
+              <w:t>cyber-brain</w:t>
             </w:r>
           </w:p>
         </w:tc>
@@ -7429,7 +7757,71 @@
                 <w:sz w:val="20"/>
                 <w:szCs w:val="20"/>
               </w:rPr>
-              <w:t xml:space="preserve">Vite dev frontend; proxies /api → backend on 8002</w:t>
+              <w:t>Cyber group knowledge system; FastAPI + dashboard; binds 127.0.0.1 by default</w:t>
+            </w:r>
+          </w:p>
+        </w:tc>
+      </w:tr>
+      <w:tr>
+        <w:tc>
+          <w:tcPr>
+            <w:tcW w:type="dxa" w:w="1440"/>
+          </w:tcPr>
+          <w:p>
+            <w:r>
+              <w:t>8773</w:t>
+            </w:r>
+          </w:p>
+        </w:tc>
+        <w:tc>
+          <w:tcPr>
+            <w:tcW w:type="dxa" w:w="3120"/>
+          </w:tcPr>
+          <w:p>
+            <w:r>
+              <w:t>project-creation</w:t>
+            </w:r>
+          </w:p>
+        </w:tc>
+        <w:tc>
+          <w:tcPr>
+            <w:tcW w:type="dxa" w:w="4800"/>
+          </w:tcPr>
+          <w:p>
+            <w:r>
+              <w:t>Reserved. create_app() exists but the CLI is still a stub — nothing serves yet</w:t>
+            </w:r>
+          </w:p>
+        </w:tc>
+      </w:tr>
+      <w:tr>
+        <w:tc>
+          <w:tcPr>
+            <w:tcW w:type="dxa" w:w="1440"/>
+          </w:tcPr>
+          <w:p>
+            <w:r>
+              <w:t>8774</w:t>
+            </w:r>
+          </w:p>
+        </w:tc>
+        <w:tc>
+          <w:tcPr>
+            <w:tcW w:type="dxa" w:w="3120"/>
+          </w:tcPr>
+          <w:p>
+            <w:r>
+              <w:t>fulcrum-replacement</w:t>
+            </w:r>
+          </w:p>
+        </w:tc>
+        <w:tc>
+          <w:tcPr>
+            <w:tcW w:type="dxa" w:w="4800"/>
+          </w:tcPr>
+          <w:p>
+            <w:r>
+              <w:t>Reserved only. No pyproject.toml or app code yet — design docs only</w:t>
             </w:r>
           </w:p>
         </w:tc>
@@ -7448,7 +7840,7 @@
           <w:sz w:val="22"/>
           <w:szCs w:val="22"/>
         </w:rPr>
-        <w:t xml:space="preserve">Note: </w:t>
+        <w:t>Note: Avoid port 8766 — silently reserved at the OS level on this machine (visible via netstat as LISTEN on 127.0.0.1:8766 with no lsof-visible owner). The claude-sync daemon binds 127.0.0.1:8866 (not a portfolio app server, but it reserves the port).</w:t>
       </w:r>
       <w:r>
         <w:rPr>
@@ -7457,7 +7849,6 @@
           <w:sz w:val="22"/>
           <w:szCs w:val="22"/>
         </w:rPr>
-        <w:t xml:space="preserve">Avoid port 8766 — silently reserved at the OS level on this machine. The claude-sync daemon binds 127.0.0.1:8866 (not a portfolio app server, but it reserves the port).</w:t>
       </w:r>
     </w:p>
     <w:p>
@@ -7542,7 +7933,7 @@
           <w:sz w:val="22"/>
           <w:szCs w:val="22"/>
         </w:rPr>
-        <w:t xml:space="preserve">Pocket Probe — v0 PCB layout in KiCad; field-appliance enclosure design</w:t>
+        <w:t>floor-plan-editor — locate it. It is in the registry but exists nowhere on this Mac, is gitignored with zero tracked files, and appears in none of the migration batches. Check the Mac Studio and Time Machine.</w:t>
       </w:r>
     </w:p>
     <w:p>
@@ -7561,7 +7952,7 @@
           <w:sz w:val="22"/>
           <w:szCs w:val="22"/>
         </w:rPr>
-        <w:t xml:space="preserve">ethernet-link-analyzer — Phase 4: long-duration monitoring, ARP host inventory, baseline/drift anomaly detection (Phases 1–3 complete)</w:t>
+        <w:t>ssi-design-system — fix apps.json's _root (still the pre-migration ~/Documents/dev), which currently makes sync.py a no-op for all six consumers; add scribe as a tracked consumer.</w:t>
       </w:r>
     </w:p>
     <w:p>
@@ -7580,7 +7971,7 @@
           <w:sz w:val="22"/>
           <w:szCs w:val="22"/>
         </w:rPr>
-        <w:t xml:space="preserve">cert-manager — multi-stage name extraction pipeline; write-back for cert updates</w:t>
+        <w:t>pocket-probe — v0 PCB layout in KiCad; field-appliance enclosure design.</w:t>
       </w:r>
     </w:p>
     <w:p>
@@ -7599,7 +7990,7 @@
           <w:sz w:val="22"/>
           <w:szCs w:val="22"/>
         </w:rPr>
-        <w:t xml:space="preserve">niagara-llm (CASCADE) — closed-loop write-back, fleet monitoring, and operator dashboard</w:t>
+        <w:t>ethernet-link-analyzer — Phase 4: long-duration monitoring, ARP host inventory, baseline/drift anomaly detection (Phases 1–3 complete).</w:t>
       </w:r>
     </w:p>
     <w:p>
@@ -7618,7 +8009,7 @@
           <w:sz w:val="22"/>
           <w:szCs w:val="22"/>
         </w:rPr>
-        <w:t xml:space="preserve">siem-forwarder — bind design-complete skeleton to a target Niagara 4.15.1 build (slot-o-matic, alarm/audit listener types, TLS trust store)</w:t>
+        <w:t>cert-manager — grow the test suite (7 tests today, the thinnest of any production-facing app here); write-back for cert updates.</w:t>
       </w:r>
     </w:p>
     <w:p>
@@ -7637,7 +8028,7 @@
           <w:sz w:val="22"/>
           <w:szCs w:val="22"/>
         </w:rPr>
-        <w:t xml:space="preserve">cyber-brain — mature v0.1 Graph-ingestion prototype (briefs, cited Q&amp;A, digests) toward production use</w:t>
+        <w:t>niagara-llm (CASCADE) — close the pilot-pending gates: real Niagara histories, alarms, and a sustained soak test on an authorized station.</w:t>
       </w:r>
     </w:p>
     <w:p>
@@ -7656,7 +8047,64 @@
           <w:sz w:val="22"/>
           <w:szCs w:val="22"/>
         </w:rPr>
-        <w:t xml:space="preserve">outlook-followup — clarify scope and build out stub project</w:t>
+        <w:t>siem-forwarder — bind the design-complete skeleton to a target Niagara 4.15.1 build (slot-o-matic, alarm/audit listener types, TLS trust store); it cannot be build-verified on this Mac.</w:t>
+      </w:r>
+    </w:p>
+    <w:p>
+      <w:pPr>
+        <w:pStyle w:val="ListParagraph"/>
+        <w:numPr>
+          <w:ilvl w:val="0"/>
+          <w:numId w:val="1"/>
+        </w:numPr>
+        <w:spacing w:after="40" w:before="40"/>
+      </w:pPr>
+      <w:r>
+        <w:rPr>
+          <w:rFonts w:ascii="Arial" w:cs="Arial" w:eastAsia="Arial" w:hAnsi="Arial"/>
+          <w:color w:val="1A1A1A"/>
+          <w:sz w:val="22"/>
+          <w:szCs w:val="22"/>
+        </w:rPr>
+        <w:t>project-creation — wire the CLI's run/uvicorn path so the reserved port 8773 actually serves.</w:t>
+      </w:r>
+    </w:p>
+    <w:p>
+      <w:pPr>
+        <w:pStyle w:val="ListParagraph"/>
+        <w:numPr>
+          <w:ilvl w:val="0"/>
+          <w:numId w:val="1"/>
+        </w:numPr>
+        <w:spacing w:after="40" w:before="40"/>
+      </w:pPr>
+      <w:r>
+        <w:rPr>
+          <w:rFonts w:ascii="Arial" w:cs="Arial" w:eastAsia="Arial" w:hAnsi="Arial"/>
+          <w:color w:val="1A1A1A"/>
+          <w:sz w:val="22"/>
+          <w:szCs w:val="22"/>
+        </w:rPr>
+        <w:t>cyber-brain — mature the v0.1 Graph-ingestion prototype (briefs, cited Q&amp;A, digests) toward production use; quiet since 2026-07.</w:t>
+      </w:r>
+    </w:p>
+    <w:p>
+      <w:pPr>
+        <w:pStyle w:val="ListParagraph"/>
+        <w:numPr>
+          <w:ilvl w:val="0"/>
+          <w:numId w:val="1"/>
+        </w:numPr>
+        <w:spacing w:after="40" w:before="40"/>
+      </w:pPr>
+      <w:r>
+        <w:rPr>
+          <w:rFonts w:ascii="Arial" w:cs="Arial" w:eastAsia="Arial" w:hAnsi="Arial"/>
+          <w:color w:val="1A1A1A"/>
+          <w:sz w:val="22"/>
+          <w:szCs w:val="22"/>
+        </w:rPr>
+        <w:t>outlook-followup — fix or retire. Not the stub the registry called it (~1,300 LOC, real README, working webpack build), but not working either: its Graph half is dead because mailbox.js passes a callback to the promise-only Office.auth.getAccessToken, and storage.addItem() dedups on a conversationId that is null at compose time. Needs both defects fixed, a test suite, and a deployment call.</w:t>
       </w:r>
     </w:p>
     <w:p>
@@ -7692,7 +8140,7 @@
           <w:sz w:val="22"/>
           <w:szCs w:val="22"/>
         </w:rPr>
-        <w:t xml:space="preserve">ssi-design-system — roll out to all SSi web apps beyond project-tracking pilot</w:t>
+        <w:t>digital-twin — cut a tagged release; the line has run from rev 1.10 to rev 2.15 entirely under [Unreleased], with 1.9 still the last tagged version.</w:t>
       </w:r>
     </w:p>
     <w:p>
@@ -7711,7 +8159,7 @@
           <w:sz w:val="22"/>
           <w:szCs w:val="22"/>
         </w:rPr>
-        <w:t xml:space="preserve">email-processor → past-performance integration — auto-surface relevant PP when triaging solicitations</w:t>
+        <w:t>digital-twin — bring barracks-cep FDD coverage to parity with office-building's 65 detectors; land the Supervisor backup as a selectable third twin model.</w:t>
       </w:r>
     </w:p>
     <w:p>
@@ -7730,7 +8178,7 @@
           <w:sz w:val="22"/>
           <w:szCs w:val="22"/>
         </w:rPr>
-        <w:t xml:space="preserve">project-tracking — MS Project schedule diff UI (per-job ACLs + sharing shipped June 2026)</w:t>
+        <w:t>ssi-design-system — roll out to the remaining SSi web apps beyond the project-tracking pilot.</w:t>
       </w:r>
     </w:p>
     <w:p>
@@ -7749,7 +8197,7 @@
           <w:sz w:val="22"/>
           <w:szCs w:val="22"/>
         </w:rPr>
-        <w:t xml:space="preserve">network-scanner — scan scheduling (BACnet ReadProperty enumeration shipped)</w:t>
+        <w:t>email-processor → past-performance integration — auto-surface relevant PP when triaging solicitations.</w:t>
       </w:r>
     </w:p>
     <w:p>
@@ -7768,7 +8216,64 @@
           <w:sz w:val="22"/>
           <w:szCs w:val="22"/>
         </w:rPr>
-        <w:t>fulcrum-replacement — move from design (rev 4, July 2026) to implementation; offline-durability risk spike first; proposed port 8774</w:t>
+        <w:t>project-tracking — MS Project schedule diff UI (per-job ACLs + sharing shipped June 2026).</w:t>
+      </w:r>
+    </w:p>
+    <w:p>
+      <w:pPr>
+        <w:pStyle w:val="ListParagraph"/>
+        <w:numPr>
+          <w:ilvl w:val="0"/>
+          <w:numId w:val="1"/>
+        </w:numPr>
+        <w:spacing w:after="40" w:before="40"/>
+      </w:pPr>
+      <w:r>
+        <w:rPr>
+          <w:rFonts w:ascii="Arial" w:cs="Arial" w:eastAsia="Arial" w:hAnsi="Arial"/>
+          <w:color w:val="1A1A1A"/>
+          <w:sz w:val="22"/>
+          <w:szCs w:val="22"/>
+        </w:rPr>
+        <w:t>network-scanner — scan scheduling (BACnet ReadProperty enumeration shipped).</w:t>
+      </w:r>
+    </w:p>
+    <w:p>
+      <w:pPr>
+        <w:pStyle w:val="ListParagraph"/>
+        <w:numPr>
+          <w:ilvl w:val="0"/>
+          <w:numId w:val="1"/>
+        </w:numPr>
+        <w:spacing w:after="40" w:before="40"/>
+      </w:pPr>
+      <w:r>
+        <w:rPr>
+          <w:rFonts w:ascii="Arial" w:cs="Arial" w:eastAsia="Arial" w:hAnsi="Arial"/>
+          <w:color w:val="1A1A1A"/>
+          <w:sz w:val="22"/>
+          <w:szCs w:val="22"/>
+        </w:rPr>
+        <w:t>fulcrum-replacement — move from design (rev 4, 2026-07-02) to implementation; offline-durability risk spike first; proposed port 8774.</w:t>
+      </w:r>
+    </w:p>
+    <w:p>
+      <w:pPr>
+        <w:pStyle w:val="ListParagraph"/>
+        <w:numPr>
+          <w:ilvl w:val="0"/>
+          <w:numId w:val="1"/>
+        </w:numPr>
+        <w:spacing w:after="40" w:before="40"/>
+      </w:pPr>
+      <w:r>
+        <w:rPr>
+          <w:rFonts w:ascii="Arial" w:cs="Arial" w:eastAsia="Arial" w:hAnsi="Arial"/>
+          <w:color w:val="1A1A1A"/>
+          <w:sz w:val="22"/>
+          <w:szCs w:val="22"/>
+        </w:rPr>
+        <w:t>stream-deck — decide whether SSi Deck graduates into the project registry; it already builds and validates.</w:t>
       </w:r>
     </w:p>
     <w:p>
@@ -7804,7 +8309,7 @@
           <w:sz w:val="22"/>
           <w:szCs w:val="22"/>
         </w:rPr>
-        <w:t xml:space="preserve">Unified SSi portal — consolidate project-tracking, past-performance, cert-manager, and email-processor under a single auth/design-system shell</w:t>
+        <w:t>Unified SSi portal — consolidate project-tracking, past-performance, cert-manager, and email-processor under a single auth/design-system shell.</w:t>
       </w:r>
     </w:p>
     <w:p>
@@ -7823,7 +8328,7 @@
           <w:sz w:val="22"/>
           <w:szCs w:val="22"/>
         </w:rPr>
-        <w:t xml:space="preserve">Pocket Probe v1.0 — production PCB, STM32 firmware with USB-C + status LED; field-deployable device</w:t>
+        <w:t>pocket-probe v1.0 — production PCB, STM32 firmware with USB-C + status LED; field-deployable device.</w:t>
       </w:r>
     </w:p>
     <w:p>
@@ -7842,7 +8347,26 @@
           <w:sz w:val="22"/>
           <w:szCs w:val="22"/>
         </w:rPr>
-        <w:t xml:space="preserve">rfp-automation Power Automate integration — push new opportunities directly into project-tracking pipeline</w:t>
+        <w:t>rfp-automation → project-tracking handoff — push newly awarded opportunities straight into the tracking pipeline via project-creation.</w:t>
+      </w:r>
+    </w:p>
+    <w:p>
+      <w:pPr>
+        <w:pStyle w:val="ListParagraph"/>
+        <w:numPr>
+          <w:ilvl w:val="0"/>
+          <w:numId w:val="1"/>
+        </w:numPr>
+        <w:spacing w:after="40" w:before="40"/>
+      </w:pPr>
+      <w:r>
+        <w:rPr>
+          <w:rFonts w:ascii="Arial" w:cs="Arial" w:eastAsia="Arial" w:hAnsi="Arial"/>
+          <w:color w:val="1A1A1A"/>
+          <w:sz w:val="22"/>
+          <w:szCs w:val="22"/>
+        </w:rPr>
+        <w:t>Consolidate the Niagara stack — niagara-config, niagara-llm, digital-twin, and siem-forwarder now form a coherent BAS product line; consider a shared release and demo story.</w:t>
       </w:r>
     </w:p>
     <w:p>
@@ -7924,7 +8448,7 @@
                 <w:sz w:val="20"/>
                 <w:szCs w:val="20"/>
               </w:rPr>
-              <w:t xml:space="preserve">Term</w:t>
+              <w:t>Term</w:t>
             </w:r>
           </w:p>
         </w:tc>
@@ -7955,7 +8479,7 @@
                 <w:sz w:val="20"/>
                 <w:szCs w:val="20"/>
               </w:rPr>
-              <w:t xml:space="preserve">Meaning</w:t>
+              <w:t>Meaning</w:t>
             </w:r>
           </w:p>
         </w:tc>
@@ -7988,7 +8512,7 @@
                 <w:sz w:val="20"/>
                 <w:szCs w:val="20"/>
               </w:rPr>
-              <w:t xml:space="preserve">UFGS 25 05 11</w:t>
+              <w:t>UFGS 25 05 11</w:t>
             </w:r>
           </w:p>
         </w:tc>
@@ -8017,7 +8541,7 @@
                 <w:sz w:val="20"/>
                 <w:szCs w:val="20"/>
               </w:rPr>
-              <w:t xml:space="preserve">Unified Facilities Guide Spec — Cybersecurity of Facility-Related Control Systems</w:t>
+              <w:t>Unified Facilities Guide Spec — Cybersecurity of Facility-Related Control Systems</w:t>
             </w:r>
           </w:p>
         </w:tc>
@@ -8050,7 +8574,7 @@
                 <w:sz w:val="20"/>
                 <w:szCs w:val="20"/>
               </w:rPr>
-              <w:t xml:space="preserve">UFGS 25 08 11</w:t>
+              <w:t>UFGS 25 08 11</w:t>
             </w:r>
           </w:p>
         </w:tc>
@@ -8079,7 +8603,7 @@
                 <w:sz w:val="20"/>
                 <w:szCs w:val="20"/>
               </w:rPr>
-              <w:t xml:space="preserve">Unified Facilities Guide Spec — Cybersecurity Commissioning of FRCS</w:t>
+              <w:t>Unified Facilities Guide Spec — Cybersecurity Commissioning of FRCS</w:t>
             </w:r>
           </w:p>
         </w:tc>
@@ -8112,7 +8636,7 @@
                 <w:sz w:val="20"/>
                 <w:szCs w:val="20"/>
               </w:rPr>
-              <w:t xml:space="preserve">MATOC</w:t>
+              <w:t>MATOC</w:t>
             </w:r>
           </w:p>
         </w:tc>
@@ -8141,7 +8665,7 @@
                 <w:sz w:val="20"/>
                 <w:szCs w:val="20"/>
               </w:rPr>
-              <w:t xml:space="preserve">Multiple Award Task Order Contract (USACE vehicle for MILCON cyber work)</w:t>
+              <w:t>Multiple Award Task Order Contract (USACE vehicle for MILCON cyber work)</w:t>
             </w:r>
           </w:p>
         </w:tc>
@@ -8174,7 +8698,7 @@
                 <w:sz w:val="20"/>
                 <w:szCs w:val="20"/>
               </w:rPr>
-              <w:t xml:space="preserve">MRR</w:t>
+              <w:t>MRR</w:t>
             </w:r>
           </w:p>
         </w:tc>
@@ -8203,7 +8727,7 @@
                 <w:sz w:val="20"/>
                 <w:szCs w:val="20"/>
               </w:rPr>
-              <w:t xml:space="preserve">MATOC contract vehicle name (SSi has award)</w:t>
+              <w:t>MATOC contract vehicle name (SSi has award)</w:t>
             </w:r>
           </w:p>
         </w:tc>
@@ -8236,7 +8760,7 @@
                 <w:sz w:val="20"/>
                 <w:szCs w:val="20"/>
               </w:rPr>
-              <w:t xml:space="preserve">UMCS</w:t>
+              <w:t>UMCS</w:t>
             </w:r>
           </w:p>
         </w:tc>
@@ -8265,7 +8789,7 @@
                 <w:sz w:val="20"/>
                 <w:szCs w:val="20"/>
               </w:rPr>
-              <w:t xml:space="preserve">Utility Monitoring and Control System — second MATOC vehicle</w:t>
+              <w:t>Utility Monitoring and Control System — second MATOC vehicle</w:t>
             </w:r>
           </w:p>
         </w:tc>
@@ -8298,7 +8822,7 @@
                 <w:sz w:val="20"/>
                 <w:szCs w:val="20"/>
               </w:rPr>
-              <w:t xml:space="preserve">FRCS</w:t>
+              <w:t>FRCS</w:t>
             </w:r>
           </w:p>
         </w:tc>
@@ -8327,7 +8851,7 @@
                 <w:sz w:val="20"/>
                 <w:szCs w:val="20"/>
               </w:rPr>
-              <w:t xml:space="preserve">Facility Related Control System — DoD term covering BAS, BCS, and OT systems</w:t>
+              <w:t>Facility Related Control System — DoD term covering BAS, BCS, and OT systems</w:t>
             </w:r>
           </w:p>
         </w:tc>
@@ -8360,7 +8884,7 @@
                 <w:sz w:val="20"/>
                 <w:szCs w:val="20"/>
               </w:rPr>
-              <w:t xml:space="preserve">MILCON</w:t>
+              <w:t>MILCON</w:t>
             </w:r>
           </w:p>
         </w:tc>
@@ -8389,7 +8913,7 @@
                 <w:sz w:val="20"/>
                 <w:szCs w:val="20"/>
               </w:rPr>
-              <w:t xml:space="preserve">Military Construction — DoD capital construction program</w:t>
+              <w:t>Military Construction — DoD capital construction program</w:t>
             </w:r>
           </w:p>
         </w:tc>
@@ -8422,7 +8946,7 @@
                 <w:sz w:val="20"/>
                 <w:szCs w:val="20"/>
               </w:rPr>
-              <w:t xml:space="preserve">BAS/BCS</w:t>
+              <w:t>BAS/BCS</w:t>
             </w:r>
           </w:p>
         </w:tc>
@@ -8451,7 +8975,7 @@
                 <w:sz w:val="20"/>
                 <w:szCs w:val="20"/>
               </w:rPr>
-              <w:t xml:space="preserve">Building Automation System / Building Control System</w:t>
+              <w:t>Building Automation System / Building Control System</w:t>
             </w:r>
           </w:p>
         </w:tc>
@@ -8484,7 +9008,7 @@
                 <w:sz w:val="20"/>
                 <w:szCs w:val="20"/>
               </w:rPr>
-              <w:t xml:space="preserve">EAC</w:t>
+              <w:t>RMF</w:t>
             </w:r>
           </w:p>
         </w:tc>
@@ -8513,7 +9037,7 @@
                 <w:sz w:val="20"/>
                 <w:szCs w:val="20"/>
               </w:rPr>
-              <w:t xml:space="preserve">Estimate at Completion — earned-value forecasting metric</w:t>
+              <w:t>Risk Management Framework — the DoD accreditation process network-scanner's audit output targets</w:t>
             </w:r>
           </w:p>
         </w:tc>
@@ -8546,7 +9070,7 @@
                 <w:sz w:val="20"/>
                 <w:szCs w:val="20"/>
               </w:rPr>
-              <w:t xml:space="preserve">ETC</w:t>
+              <w:t>CUI</w:t>
             </w:r>
           </w:p>
         </w:tc>
@@ -8575,7 +9099,7 @@
                 <w:sz w:val="20"/>
                 <w:szCs w:val="20"/>
               </w:rPr>
-              <w:t xml:space="preserve">Estimate to Complete — earned-value forecasting metric</w:t>
+              <w:t>Controlled Unclassified Information — drives local-LLM (Ollama) paths over cloud API calls</w:t>
             </w:r>
           </w:p>
         </w:tc>
@@ -8608,7 +9132,7 @@
                 <w:sz w:val="20"/>
                 <w:szCs w:val="20"/>
               </w:rPr>
-              <w:t xml:space="preserve">CPI</w:t>
+              <w:t>EAC</w:t>
             </w:r>
           </w:p>
         </w:tc>
@@ -8637,7 +9161,7 @@
                 <w:sz w:val="20"/>
                 <w:szCs w:val="20"/>
               </w:rPr>
-              <w:t xml:space="preserve">Cost Performance Index (earned value / actual cost)</w:t>
+              <w:t>Estimate at Completion — earned-value forecasting metric</w:t>
             </w:r>
           </w:p>
         </w:tc>
@@ -8670,7 +9194,7 @@
                 <w:sz w:val="20"/>
                 <w:szCs w:val="20"/>
               </w:rPr>
-              <w:t xml:space="preserve">SPI</w:t>
+              <w:t>ETC</w:t>
             </w:r>
           </w:p>
         </w:tc>
@@ -8699,7 +9223,7 @@
                 <w:sz w:val="20"/>
                 <w:szCs w:val="20"/>
               </w:rPr>
-              <w:t xml:space="preserve">Schedule Performance Index (earned value / planned value)</w:t>
+              <w:t>Estimate to Complete — earned-value forecasting metric</w:t>
             </w:r>
           </w:p>
         </w:tc>
@@ -8732,7 +9256,7 @@
                 <w:sz w:val="20"/>
                 <w:szCs w:val="20"/>
               </w:rPr>
-              <w:t xml:space="preserve">CLIN</w:t>
+              <w:t>CPI</w:t>
             </w:r>
           </w:p>
         </w:tc>
@@ -8761,7 +9285,7 @@
                 <w:sz w:val="20"/>
                 <w:szCs w:val="20"/>
               </w:rPr>
-              <w:t xml:space="preserve">Contract Line Item Number — pricing structure in DoD proposals</w:t>
+              <w:t>Cost Performance Index (earned value / actual cost)</w:t>
             </w:r>
           </w:p>
         </w:tc>
@@ -8794,7 +9318,7 @@
                 <w:sz w:val="20"/>
                 <w:szCs w:val="20"/>
               </w:rPr>
-              <w:t xml:space="preserve">JBLM</w:t>
+              <w:t>SPI</w:t>
             </w:r>
           </w:p>
         </w:tc>
@@ -8823,7 +9347,7 @@
                 <w:sz w:val="20"/>
                 <w:szCs w:val="20"/>
               </w:rPr>
-              <w:t xml:space="preserve">Joint Base Lewis-McChord — site used in kml and virtual-devices projects</w:t>
+              <w:t>Schedule Performance Index (earned value / planned value)</w:t>
             </w:r>
           </w:p>
         </w:tc>
@@ -8856,7 +9380,7 @@
                 <w:sz w:val="20"/>
                 <w:szCs w:val="20"/>
               </w:rPr>
-              <w:t xml:space="preserve">LLDP</w:t>
+              <w:t>CLIN</w:t>
             </w:r>
           </w:p>
         </w:tc>
@@ -8885,7 +9409,7 @@
                 <w:sz w:val="20"/>
                 <w:szCs w:val="20"/>
               </w:rPr>
-              <w:t xml:space="preserve">Link Layer Discovery Protocol — IEEE 802.1AB; used by ethernet-link-analyzer and Pocket Probe</w:t>
+              <w:t>Contract Line Item Number — pricing structure in DoD proposals</w:t>
             </w:r>
           </w:p>
         </w:tc>
@@ -8918,7 +9442,7 @@
                 <w:sz w:val="20"/>
                 <w:szCs w:val="20"/>
               </w:rPr>
-              <w:t xml:space="preserve">CDP</w:t>
+              <w:t>PWS</w:t>
             </w:r>
           </w:p>
         </w:tc>
@@ -8947,7 +9471,7 @@
                 <w:sz w:val="20"/>
                 <w:szCs w:val="20"/>
               </w:rPr>
-              <w:t xml:space="preserve">Cisco Discovery Protocol — used alongside LLDP in ethernet-link-analyzer</w:t>
+              <w:t>Performance Work Statement — government contract document fetched by email-processor</w:t>
             </w:r>
           </w:p>
         </w:tc>
@@ -8980,7 +9504,7 @@
                 <w:sz w:val="20"/>
                 <w:szCs w:val="20"/>
               </w:rPr>
-              <w:t xml:space="preserve">macvlan</w:t>
+              <w:t>JBLM</w:t>
             </w:r>
           </w:p>
         </w:tc>
@@ -9009,7 +9533,7 @@
                 <w:sz w:val="20"/>
                 <w:szCs w:val="20"/>
               </w:rPr>
-              <w:t xml:space="preserve">Linux Docker network mode enabling containers to appear as physical hosts on a LAN</w:t>
+              <w:t>Joint Base Lewis-McChord — site used in the kml project</w:t>
             </w:r>
           </w:p>
         </w:tc>
@@ -9042,7 +9566,7 @@
                 <w:sz w:val="20"/>
                 <w:szCs w:val="20"/>
               </w:rPr>
-              <w:t xml:space="preserve">FTS5</w:t>
+              <w:t>DOPPEL</w:t>
             </w:r>
           </w:p>
         </w:tc>
@@ -9071,7 +9595,7 @@
                 <w:sz w:val="20"/>
                 <w:szCs w:val="20"/>
               </w:rPr>
-              <w:t xml:space="preserve">SQLite Full-Text Search extension v5 — used in past-performance and project-tracking</w:t>
+              <w:t>Product name for the digital-twin FRCS simulator</w:t>
             </w:r>
           </w:p>
         </w:tc>
@@ -9104,7 +9628,7 @@
                 <w:sz w:val="20"/>
                 <w:szCs w:val="20"/>
               </w:rPr>
-              <w:t xml:space="preserve">CMMC</w:t>
+              <w:t>CASCADE</w:t>
             </w:r>
           </w:p>
         </w:tc>
@@ -9133,7 +9657,7 @@
                 <w:sz w:val="20"/>
                 <w:szCs w:val="20"/>
               </w:rPr>
-              <w:t xml:space="preserve">Cybersecurity Maturity Model Certification — drives no-Graph-API design in email-processor</w:t>
+              <w:t>Continuous Analysis, Site Commissioning &amp; Anomaly-Detection Engine — product name for niagara-llm</w:t>
             </w:r>
           </w:p>
         </w:tc>
@@ -9166,7 +9690,7 @@
                 <w:sz w:val="20"/>
                 <w:szCs w:val="20"/>
               </w:rPr>
-              <w:t xml:space="preserve">PWS</w:t>
+              <w:t>oBIX</w:t>
             </w:r>
           </w:p>
         </w:tc>
@@ -9195,7 +9719,183 @@
                 <w:sz w:val="20"/>
                 <w:szCs w:val="20"/>
               </w:rPr>
-              <w:t xml:space="preserve">Performance Work Statement — government contract document fetched by email-processor</w:t>
+              <w:t>Open Building Information Exchange — the REST/XML interface CASCADE reads a Niagara station through</w:t>
+            </w:r>
+          </w:p>
+        </w:tc>
+      </w:tr>
+      <w:tr>
+        <w:tc>
+          <w:tcPr>
+            <w:tcW w:type="dxa" w:w="2200"/>
+          </w:tcPr>
+          <w:p>
+            <w:r>
+              <w:t>BQL</w:t>
+            </w:r>
+          </w:p>
+        </w:tc>
+        <w:tc>
+          <w:tcPr>
+            <w:tcW w:type="dxa" w:w="7160"/>
+          </w:tcPr>
+          <w:p>
+            <w:r>
+              <w:t>Baja Query Language — Niagara's query language, used for station data and history retrieval</w:t>
+            </w:r>
+          </w:p>
+        </w:tc>
+      </w:tr>
+      <w:tr>
+        <w:tc>
+          <w:tcPr>
+            <w:tcW w:type="dxa" w:w="2200"/>
+          </w:tcPr>
+          <w:p>
+            <w:r>
+              <w:t>FDD</w:t>
+            </w:r>
+          </w:p>
+        </w:tc>
+        <w:tc>
+          <w:tcPr>
+            <w:tcW w:type="dxa" w:w="7160"/>
+          </w:tcPr>
+          <w:p>
+            <w:r>
+              <w:t>Fault Detection &amp; Diagnostics — the detector engine in digital-twin and niagara-llm</w:t>
+            </w:r>
+          </w:p>
+        </w:tc>
+      </w:tr>
+      <w:tr>
+        <w:tc>
+          <w:tcPr>
+            <w:tcW w:type="dxa" w:w="2200"/>
+          </w:tcPr>
+          <w:p>
+            <w:r>
+              <w:t>config.bog</w:t>
+            </w:r>
+          </w:p>
+        </w:tc>
+        <w:tc>
+          <w:tcPr>
+            <w:tcW w:type="dxa" w:w="7160"/>
+          </w:tcPr>
+          <w:p>
+            <w:r>
+              <w:t>A Niagara station database inside a Supervisor backup; parsed by niagara-config</w:t>
+            </w:r>
+          </w:p>
+        </w:tc>
+      </w:tr>
+      <w:tr>
+        <w:tc>
+          <w:tcPr>
+            <w:tcW w:type="dxa" w:w="2200"/>
+          </w:tcPr>
+          <w:p>
+            <w:r>
+              <w:t>LLDP</w:t>
+            </w:r>
+          </w:p>
+        </w:tc>
+        <w:tc>
+          <w:tcPr>
+            <w:tcW w:type="dxa" w:w="7160"/>
+          </w:tcPr>
+          <w:p>
+            <w:r>
+              <w:t>Link Layer Discovery Protocol — IEEE 802.1AB; used by ethernet-link-analyzer and pocket-probe</w:t>
+            </w:r>
+          </w:p>
+        </w:tc>
+      </w:tr>
+      <w:tr>
+        <w:tc>
+          <w:tcPr>
+            <w:tcW w:type="dxa" w:w="2200"/>
+          </w:tcPr>
+          <w:p>
+            <w:r>
+              <w:t>CDP</w:t>
+            </w:r>
+          </w:p>
+        </w:tc>
+        <w:tc>
+          <w:tcPr>
+            <w:tcW w:type="dxa" w:w="7160"/>
+          </w:tcPr>
+          <w:p>
+            <w:r>
+              <w:t>Cisco Discovery Protocol — used alongside LLDP in ethernet-link-analyzer</w:t>
+            </w:r>
+          </w:p>
+        </w:tc>
+      </w:tr>
+      <w:tr>
+        <w:tc>
+          <w:tcPr>
+            <w:tcW w:type="dxa" w:w="2200"/>
+          </w:tcPr>
+          <w:p>
+            <w:r>
+              <w:t>macvlan</w:t>
+            </w:r>
+          </w:p>
+        </w:tc>
+        <w:tc>
+          <w:tcPr>
+            <w:tcW w:type="dxa" w:w="7160"/>
+          </w:tcPr>
+          <w:p>
+            <w:r>
+              <w:t>Linux Docker network mode enabling containers to appear as physical hosts on a LAN</w:t>
+            </w:r>
+          </w:p>
+        </w:tc>
+      </w:tr>
+      <w:tr>
+        <w:tc>
+          <w:tcPr>
+            <w:tcW w:type="dxa" w:w="2200"/>
+          </w:tcPr>
+          <w:p>
+            <w:r>
+              <w:t>FTS5</w:t>
+            </w:r>
+          </w:p>
+        </w:tc>
+        <w:tc>
+          <w:tcPr>
+            <w:tcW w:type="dxa" w:w="7160"/>
+          </w:tcPr>
+          <w:p>
+            <w:r>
+              <w:t>SQLite Full-Text Search extension v5 — used across past-performance, cyber-brain, and scribe</w:t>
+            </w:r>
+          </w:p>
+        </w:tc>
+      </w:tr>
+      <w:tr>
+        <w:tc>
+          <w:tcPr>
+            <w:tcW w:type="dxa" w:w="2200"/>
+          </w:tcPr>
+          <w:p>
+            <w:r>
+              <w:t>CMMC</w:t>
+            </w:r>
+          </w:p>
+        </w:tc>
+        <w:tc>
+          <w:tcPr>
+            <w:tcW w:type="dxa" w:w="7160"/>
+          </w:tcPr>
+          <w:p>
+            <w:r>
+              <w:t>Cybersecurity Maturity Model Certification — drives the no-Graph-API design in email-processor</w:t>
             </w:r>
           </w:p>
         </w:tc>

</xml_diff>